<commit_message>
Rewrite Three Questions Synthesis with ZipperGen as breakthrough — closes MPST gap
</commit_message>
<xml_diff>
--- a/Agent_Governance_Three_Questions_Synthesis.docx
+++ b/Agent_Governance_Three_Questions_Synthesis.docx
@@ -2,7 +2,7 @@
 <file path=word/document.xml><?xml version="1.0" encoding="utf-8"?>
 <w:document xmlns:w="http://schemas.openxmlformats.org/wordprocessingml/2006/main" xmlns:m="http://schemas.openxmlformats.org/officeDocument/2006/math" xmlns:r="http://schemas.openxmlformats.org/officeDocument/2006/relationships" xmlns:o="urn:schemas-microsoft-com:office:office" xmlns:v="urn:schemas-microsoft-com:vml" xmlns:w10="urn:schemas-microsoft-com:office:word" xmlns:a="http://schemas.openxmlformats.org/drawingml/2006/main" xmlns:pic="http://schemas.openxmlformats.org/drawingml/2006/picture" xmlns:wp="http://schemas.openxmlformats.org/drawingml/2006/wordprocessingDrawing">
   <w:body>
-    <w:bookmarkStart w:id="61" w:name="X0992f1a2b2abf70de3651cc59924546688bff95"/>
+    <w:bookmarkStart w:id="63" w:name="X0992f1a2b2abf70de3651cc59924546688bff95"/>
     <w:p>
       <w:pPr>
         <w:pStyle w:val="Heading1"/>
@@ -1197,7 +1197,7 @@
     </w:p>
     <w:bookmarkEnd w:id="28"/>
     <w:bookmarkEnd w:id="29"/>
-    <w:bookmarkStart w:id="41" w:name="X238ca547c92110a2df0c1f4c51c6fe03e10b3f7"/>
+    <w:bookmarkStart w:id="42" w:name="X238ca547c92110a2df0c1f4c51c6fe03e10b3f7"/>
     <w:p>
       <w:pPr>
         <w:pStyle w:val="Heading2"/>
@@ -1206,7 +1206,7 @@
         <w:t xml:space="preserve">Question 2: Formal Static Typing / Checking Before Runtime?</w:t>
       </w:r>
     </w:p>
-    <w:bookmarkStart w:id="30" w:name="Xc99ea24ce95f7de7ba8db95861004e860ea72bf"/>
+    <w:bookmarkStart w:id="30" w:name="X5330657c41271df6869b834d4f2e28a41837064"/>
     <w:p>
       <w:pPr>
         <w:pStyle w:val="Heading3"/>
@@ -1222,7 +1222,7 @@
           <w:bCs/>
           <w:b/>
         </w:rPr>
-        <w:t xml:space="preserve">Yes, multiple approaches exist — but none are universally deployed.</w:t>
+        <w:t xml:space="preserve">Yes — and ZipperGen (arXiv:2604.17612) is the breakthrough for multi-agent coordination.</w:t>
       </w:r>
     </w:p>
     <w:p>
@@ -1233,7 +1233,7 @@
       </w:r>
     </w:p>
     <w:bookmarkEnd w:id="30"/>
-    <w:bookmarkStart w:id="38" w:name="Xaf3d8df77cd0a6503f40b2ceda3b7e84615d84f"/>
+    <w:bookmarkStart w:id="39" w:name="Xaf3d8df77cd0a6503f40b2ceda3b7e84615d84f"/>
     <w:p>
       <w:pPr>
         <w:pStyle w:val="Heading3"/>
@@ -1242,7 +1242,7 @@
         <w:t xml:space="preserve">Papers With Static Analysis / Pre-Runtime Verification</w:t>
       </w:r>
     </w:p>
-    <w:bookmarkStart w:id="31" w:name="Xf1acfff1cf051b64d515269544abaf2821e2534"/>
+    <w:bookmarkStart w:id="31" w:name="X9e3ea7b15a6770f5a24fdae3b1a3a57ab07607f"/>
     <w:p>
       <w:pPr>
         <w:pStyle w:val="Heading4"/>
@@ -1258,6 +1258,174 @@
           <w:bCs/>
           <w:b/>
         </w:rPr>
+        <w:t xml:space="preserve">ZipperGen / Provable Coordination for LLM Agents via MSCs</w:t>
+      </w:r>
+      <w:r>
+        <w:t xml:space="preserve"> </w:t>
+      </w:r>
+      <w:r>
+        <w:t xml:space="preserve">(arXiv:2604.17612, Cross-layer Layer 0+1) —</w:t>
+      </w:r>
+      <w:r>
+        <w:t xml:space="preserve"> </w:t>
+      </w:r>
+      <w:r>
+        <w:rPr>
+          <w:bCs/>
+          <w:b/>
+        </w:rPr>
+        <w:t xml:space="preserve">Multi-Agent Coordination</w:t>
+      </w:r>
+    </w:p>
+    <w:p>
+      <w:pPr>
+        <w:numPr>
+          <w:ilvl w:val="0"/>
+          <w:numId w:val="1006"/>
+        </w:numPr>
+        <w:pStyle w:val="Compact"/>
+      </w:pPr>
+      <w:r>
+        <w:rPr>
+          <w:bCs/>
+          <w:b/>
+        </w:rPr>
+        <w:t xml:space="preserve">What it does:</w:t>
+      </w:r>
+      <w:r>
+        <w:t xml:space="preserve"> </w:t>
+      </w:r>
+      <w:r>
+        <w:t xml:space="preserve">Domain-specific language (DSL) for specifying multi-agent coordination using Message Sequence Charts (MSCs). Syntax-directed projection generates deadlock-free local agent programs from global coordination specifications.</w:t>
+      </w:r>
+    </w:p>
+    <w:p>
+      <w:pPr>
+        <w:numPr>
+          <w:ilvl w:val="0"/>
+          <w:numId w:val="1006"/>
+        </w:numPr>
+        <w:pStyle w:val="Compact"/>
+      </w:pPr>
+      <w:r>
+        <w:rPr>
+          <w:bCs/>
+          <w:b/>
+        </w:rPr>
+        <w:t xml:space="preserve">Static analysis:</w:t>
+      </w:r>
+      <w:r>
+        <w:t xml:space="preserve"> </w:t>
+      </w:r>
+      <w:r>
+        <w:t xml:space="preserve">Well-typedness checks (Definition 5) — payload matching, local type correctness, control condition well-typedness — all checked before any agent executes. The global workflow is a formal specification that is statically verified before projection.</w:t>
+      </w:r>
+    </w:p>
+    <w:p>
+      <w:pPr>
+        <w:numPr>
+          <w:ilvl w:val="0"/>
+          <w:numId w:val="1006"/>
+        </w:numPr>
+        <w:pStyle w:val="Compact"/>
+      </w:pPr>
+      <w:r>
+        <w:rPr>
+          <w:bCs/>
+          <w:b/>
+        </w:rPr>
+        <w:t xml:space="preserve">Formal guarantee:</w:t>
+      </w:r>
+      <w:r>
+        <w:t xml:space="preserve"> </w:t>
+      </w:r>
+      <w:r>
+        <w:t xml:space="preserve">Deadlock-free by construction (Theorem in Section 5). The projection is a structural recursion with correctness proof by structural induction.</w:t>
+      </w:r>
+    </w:p>
+    <w:p>
+      <w:pPr>
+        <w:numPr>
+          <w:ilvl w:val="0"/>
+          <w:numId w:val="1006"/>
+        </w:numPr>
+        <w:pStyle w:val="Compact"/>
+      </w:pPr>
+      <w:r>
+        <w:rPr>
+          <w:bCs/>
+          <w:b/>
+        </w:rPr>
+        <w:t xml:space="preserve">Key insight:</w:t>
+      </w:r>
+      <w:r>
+        <w:t xml:space="preserve"> </w:t>
+      </w:r>
+      <w:r>
+        <w:t xml:space="preserve">Separates deterministic message-passing structure (formally specified, statically verified) from stochastic LLM actions (opaque, unpredictable). The coordination structure is guaranteed correct regardless of LLM nondeterminism.</w:t>
+      </w:r>
+    </w:p>
+    <w:p>
+      <w:pPr>
+        <w:numPr>
+          <w:ilvl w:val="0"/>
+          <w:numId w:val="1006"/>
+        </w:numPr>
+        <w:pStyle w:val="Compact"/>
+      </w:pPr>
+      <w:r>
+        <w:rPr>
+          <w:bCs/>
+          <w:b/>
+        </w:rPr>
+        <w:t xml:space="preserve">Open source:</w:t>
+      </w:r>
+      <w:r>
+        <w:t xml:space="preserve"> </w:t>
+      </w:r>
+      <w:r>
+        <w:t xml:space="preserve">ZipperGen — https://zippergen.io</w:t>
+      </w:r>
+    </w:p>
+    <w:p>
+      <w:pPr>
+        <w:numPr>
+          <w:ilvl w:val="0"/>
+          <w:numId w:val="1006"/>
+        </w:numPr>
+        <w:pStyle w:val="Compact"/>
+      </w:pPr>
+      <w:r>
+        <w:rPr>
+          <w:bCs/>
+          <w:b/>
+        </w:rPr>
+        <w:t xml:space="preserve">Gap:</w:t>
+      </w:r>
+      <w:r>
+        <w:t xml:space="preserve"> </w:t>
+      </w:r>
+      <w:r>
+        <w:t xml:space="preserve">Only verifies coordination structure, not LLM action content. No behavioral type checking for the content of messages or actions.</w:t>
+      </w:r>
+    </w:p>
+    <w:bookmarkEnd w:id="31"/>
+    <w:bookmarkStart w:id="32" w:name="X57032bfd133179efedf98bea83551c665028ba8"/>
+    <w:p>
+      <w:pPr>
+        <w:pStyle w:val="Heading4"/>
+      </w:pPr>
+      <w:r>
+        <w:t xml:space="preserve">2.</w:t>
+      </w:r>
+      <w:r>
+        <w:t xml:space="preserve"> </w:t>
+      </w:r>
+      <w:r>
+        <w:rPr>
+          <w:bCs/>
+          <w:b/>
+        </w:rPr>
         <w:t xml:space="preserve">SkillFortify</w:t>
       </w:r>
       <w:r>
@@ -1274,14 +1442,14 @@
           <w:bCs/>
           <w:b/>
         </w:rPr>
-        <w:t xml:space="preserve">Most Advanced</w:t>
-      </w:r>
-    </w:p>
-    <w:p>
-      <w:pPr>
-        <w:numPr>
-          <w:ilvl w:val="0"/>
-          <w:numId w:val="1006"/>
+        <w:t xml:space="preserve">Most Advanced for Single-Agent Skills</w:t>
+      </w:r>
+    </w:p>
+    <w:p>
+      <w:pPr>
+        <w:numPr>
+          <w:ilvl w:val="0"/>
+          <w:numId w:val="1007"/>
         </w:numPr>
         <w:pStyle w:val="Compact"/>
       </w:pPr>
@@ -1303,7 +1471,7 @@
       <w:pPr>
         <w:numPr>
           <w:ilvl w:val="0"/>
-          <w:numId w:val="1006"/>
+          <w:numId w:val="1007"/>
         </w:numPr>
         <w:pStyle w:val="Compact"/>
       </w:pPr>
@@ -1325,7 +1493,7 @@
       <w:pPr>
         <w:numPr>
           <w:ilvl w:val="0"/>
-          <w:numId w:val="1006"/>
+          <w:numId w:val="1007"/>
         </w:numPr>
         <w:pStyle w:val="Compact"/>
       </w:pPr>
@@ -1347,7 +1515,7 @@
       <w:pPr>
         <w:numPr>
           <w:ilvl w:val="0"/>
-          <w:numId w:val="1006"/>
+          <w:numId w:val="1007"/>
         </w:numPr>
         <w:pStyle w:val="Compact"/>
       </w:pPr>
@@ -1369,7 +1537,7 @@
       <w:pPr>
         <w:numPr>
           <w:ilvl w:val="0"/>
-          <w:numId w:val="1006"/>
+          <w:numId w:val="1007"/>
         </w:numPr>
         <w:pStyle w:val="Compact"/>
       </w:pPr>
@@ -1391,7 +1559,7 @@
       <w:pPr>
         <w:numPr>
           <w:ilvl w:val="0"/>
-          <w:numId w:val="1006"/>
+          <w:numId w:val="1007"/>
         </w:numPr>
         <w:pStyle w:val="Compact"/>
       </w:pPr>
@@ -1422,7 +1590,7 @@
       <w:pPr>
         <w:numPr>
           <w:ilvl w:val="0"/>
-          <w:numId w:val="1006"/>
+          <w:numId w:val="1007"/>
         </w:numPr>
         <w:pStyle w:val="Compact"/>
       </w:pPr>
@@ -1437,17 +1605,17 @@
         <w:t xml:space="preserve"> </w:t>
       </w:r>
       <w:r>
-        <w:t xml:space="preserve">Analyzes code, not natural language skill descriptions</w:t>
-      </w:r>
-    </w:p>
-    <w:bookmarkEnd w:id="31"/>
-    <w:bookmarkStart w:id="32" w:name="Xab4c7a71c545e97965fd6a76b51676712b2179d"/>
+        <w:t xml:space="preserve">Analyzes code, not natural language skill descriptions; single-agent only</w:t>
+      </w:r>
+    </w:p>
+    <w:bookmarkEnd w:id="32"/>
+    <w:bookmarkStart w:id="33" w:name="Xab4c7a71c545e97965fd6a76b51676712b2179d"/>
     <w:p>
       <w:pPr>
         <w:pStyle w:val="Heading4"/>
       </w:pPr>
       <w:r>
-        <w:t xml:space="preserve">2.</w:t>
+        <w:t xml:space="preserve">3.</w:t>
       </w:r>
       <w:r>
         <w:t xml:space="preserve"> </w:t>
@@ -1470,7 +1638,7 @@
       <w:pPr>
         <w:numPr>
           <w:ilvl w:val="0"/>
-          <w:numId w:val="1007"/>
+          <w:numId w:val="1008"/>
         </w:numPr>
         <w:pStyle w:val="Compact"/>
       </w:pPr>
@@ -1492,7 +1660,7 @@
       <w:pPr>
         <w:numPr>
           <w:ilvl w:val="0"/>
-          <w:numId w:val="1007"/>
+          <w:numId w:val="1008"/>
         </w:numPr>
         <w:pStyle w:val="Compact"/>
       </w:pPr>
@@ -1514,7 +1682,7 @@
       <w:pPr>
         <w:numPr>
           <w:ilvl w:val="0"/>
-          <w:numId w:val="1007"/>
+          <w:numId w:val="1008"/>
         </w:numPr>
         <w:pStyle w:val="Compact"/>
       </w:pPr>
@@ -1536,7 +1704,7 @@
       <w:pPr>
         <w:numPr>
           <w:ilvl w:val="0"/>
-          <w:numId w:val="1007"/>
+          <w:numId w:val="1008"/>
         </w:numPr>
         <w:pStyle w:val="Compact"/>
       </w:pPr>
@@ -1558,7 +1726,7 @@
       <w:pPr>
         <w:numPr>
           <w:ilvl w:val="0"/>
-          <w:numId w:val="1007"/>
+          <w:numId w:val="1008"/>
         </w:numPr>
         <w:pStyle w:val="Compact"/>
       </w:pPr>
@@ -1573,17 +1741,17 @@
         <w:t xml:space="preserve"> </w:t>
       </w:r>
       <w:r>
-        <w:t xml:space="preserve">Requires skills to be written in SkIR, not natural language markdown</w:t>
-      </w:r>
-    </w:p>
-    <w:bookmarkEnd w:id="32"/>
-    <w:bookmarkStart w:id="33" w:name="Xeb52eb1c3b8da9dde58048f689cdc076d058422"/>
+        <w:t xml:space="preserve">Requires skills to be written in SkIR, not natural language markdown; single-agent only</w:t>
+      </w:r>
+    </w:p>
+    <w:bookmarkEnd w:id="33"/>
+    <w:bookmarkStart w:id="34" w:name="Xeb52eb1c3b8da9dde58048f689cdc076d058422"/>
     <w:p>
       <w:pPr>
         <w:pStyle w:val="Heading4"/>
       </w:pPr>
       <w:r>
-        <w:t xml:space="preserve">3.</w:t>
+        <w:t xml:space="preserve">4.</w:t>
       </w:r>
       <w:r>
         <w:t xml:space="preserve"> </w:t>
@@ -1606,7 +1774,7 @@
       <w:pPr>
         <w:numPr>
           <w:ilvl w:val="0"/>
-          <w:numId w:val="1008"/>
+          <w:numId w:val="1009"/>
         </w:numPr>
         <w:pStyle w:val="Compact"/>
       </w:pPr>
@@ -1628,7 +1796,7 @@
       <w:pPr>
         <w:numPr>
           <w:ilvl w:val="0"/>
-          <w:numId w:val="1008"/>
+          <w:numId w:val="1009"/>
         </w:numPr>
         <w:pStyle w:val="Compact"/>
       </w:pPr>
@@ -1650,7 +1818,7 @@
       <w:pPr>
         <w:numPr>
           <w:ilvl w:val="0"/>
-          <w:numId w:val="1008"/>
+          <w:numId w:val="1009"/>
         </w:numPr>
         <w:pStyle w:val="Compact"/>
       </w:pPr>
@@ -1665,17 +1833,17 @@
         <w:t xml:space="preserve"> </w:t>
       </w:r>
       <w:r>
-        <w:t xml:space="preserve">Contracts are natural language with structured sections, not formal logic; no type system</w:t>
-      </w:r>
-    </w:p>
-    <w:bookmarkEnd w:id="33"/>
-    <w:bookmarkStart w:id="34" w:name="X588df632d3c443426e576a4130a9e6bf7627172"/>
+        <w:t xml:space="preserve">Contracts are natural language with structured sections, not formal logic; no type system; single-agent only</w:t>
+      </w:r>
+    </w:p>
+    <w:bookmarkEnd w:id="34"/>
+    <w:bookmarkStart w:id="35" w:name="X588df632d3c443426e576a4130a9e6bf7627172"/>
     <w:p>
       <w:pPr>
         <w:pStyle w:val="Heading4"/>
       </w:pPr>
       <w:r>
-        <w:t xml:space="preserve">4.</w:t>
+        <w:t xml:space="preserve">5.</w:t>
       </w:r>
       <w:r>
         <w:t xml:space="preserve"> </w:t>
@@ -1698,7 +1866,7 @@
       <w:pPr>
         <w:numPr>
           <w:ilvl w:val="0"/>
-          <w:numId w:val="1009"/>
+          <w:numId w:val="1010"/>
         </w:numPr>
         <w:pStyle w:val="Compact"/>
       </w:pPr>
@@ -1720,7 +1888,7 @@
       <w:pPr>
         <w:numPr>
           <w:ilvl w:val="0"/>
-          <w:numId w:val="1009"/>
+          <w:numId w:val="1010"/>
         </w:numPr>
         <w:pStyle w:val="Compact"/>
       </w:pPr>
@@ -1742,7 +1910,7 @@
       <w:pPr>
         <w:numPr>
           <w:ilvl w:val="0"/>
-          <w:numId w:val="1009"/>
+          <w:numId w:val="1010"/>
         </w:numPr>
         <w:pStyle w:val="Compact"/>
       </w:pPr>
@@ -1757,17 +1925,17 @@
         <w:t xml:space="preserve"> </w:t>
       </w:r>
       <w:r>
-        <w:t xml:space="preserve">87% accuracy vs expert annotations; not a formal type system</w:t>
-      </w:r>
-    </w:p>
-    <w:bookmarkEnd w:id="34"/>
-    <w:bookmarkStart w:id="35" w:name="agentverify-preprints.org-2026-layer-12"/>
+        <w:t xml:space="preserve">87% accuracy vs expert annotations; not a formal type system; single-agent only</w:t>
+      </w:r>
+    </w:p>
+    <w:bookmarkEnd w:id="35"/>
+    <w:bookmarkStart w:id="36" w:name="agentverify-preprints.org-2026-layer-12"/>
     <w:p>
       <w:pPr>
         <w:pStyle w:val="Heading4"/>
       </w:pPr>
       <w:r>
-        <w:t xml:space="preserve">5.</w:t>
+        <w:t xml:space="preserve">6.</w:t>
       </w:r>
       <w:r>
         <w:t xml:space="preserve"> </w:t>
@@ -1790,7 +1958,7 @@
       <w:pPr>
         <w:numPr>
           <w:ilvl w:val="0"/>
-          <w:numId w:val="1010"/>
+          <w:numId w:val="1011"/>
         </w:numPr>
         <w:pStyle w:val="Compact"/>
       </w:pPr>
@@ -1812,7 +1980,7 @@
       <w:pPr>
         <w:numPr>
           <w:ilvl w:val="0"/>
-          <w:numId w:val="1010"/>
+          <w:numId w:val="1011"/>
         </w:numPr>
         <w:pStyle w:val="Compact"/>
       </w:pPr>
@@ -1834,7 +2002,7 @@
       <w:pPr>
         <w:numPr>
           <w:ilvl w:val="0"/>
-          <w:numId w:val="1010"/>
+          <w:numId w:val="1011"/>
         </w:numPr>
         <w:pStyle w:val="Compact"/>
       </w:pPr>
@@ -1856,7 +2024,7 @@
       <w:pPr>
         <w:numPr>
           <w:ilvl w:val="0"/>
-          <w:numId w:val="1010"/>
+          <w:numId w:val="1011"/>
         </w:numPr>
         <w:pStyle w:val="Compact"/>
       </w:pPr>
@@ -1871,17 +2039,17 @@
         <w:t xml:space="preserve"> </w:t>
       </w:r>
       <w:r>
-        <w:t xml:space="preserve">Post-hoc analysis, not pre-runtime type checking; requires model checking expertise</w:t>
-      </w:r>
-    </w:p>
-    <w:bookmarkEnd w:id="35"/>
-    <w:bookmarkStart w:id="36" w:name="skilldex-arxiv2604.16911-layer-0"/>
+        <w:t xml:space="preserve">Post-hoc analysis, not pre-runtime type checking; requires model checking expertise; single-agent only</w:t>
+      </w:r>
+    </w:p>
+    <w:bookmarkEnd w:id="36"/>
+    <w:bookmarkStart w:id="37" w:name="skilldex-arxiv2604.16911-layer-0"/>
     <w:p>
       <w:pPr>
         <w:pStyle w:val="Heading4"/>
       </w:pPr>
       <w:r>
-        <w:t xml:space="preserve">6.</w:t>
+        <w:t xml:space="preserve">7.</w:t>
       </w:r>
       <w:r>
         <w:t xml:space="preserve"> </w:t>
@@ -1904,7 +2072,7 @@
       <w:pPr>
         <w:numPr>
           <w:ilvl w:val="0"/>
-          <w:numId w:val="1011"/>
+          <w:numId w:val="1012"/>
         </w:numPr>
         <w:pStyle w:val="Compact"/>
       </w:pPr>
@@ -1926,7 +2094,7 @@
       <w:pPr>
         <w:numPr>
           <w:ilvl w:val="0"/>
-          <w:numId w:val="1011"/>
+          <w:numId w:val="1012"/>
         </w:numPr>
         <w:pStyle w:val="Compact"/>
       </w:pPr>
@@ -1948,7 +2116,7 @@
       <w:pPr>
         <w:numPr>
           <w:ilvl w:val="0"/>
-          <w:numId w:val="1011"/>
+          <w:numId w:val="1012"/>
         </w:numPr>
         <w:pStyle w:val="Compact"/>
       </w:pPr>
@@ -1970,7 +2138,7 @@
       <w:pPr>
         <w:numPr>
           <w:ilvl w:val="0"/>
-          <w:numId w:val="1011"/>
+          <w:numId w:val="1012"/>
         </w:numPr>
         <w:pStyle w:val="Compact"/>
       </w:pPr>
@@ -1985,17 +2153,17 @@
         <w:t xml:space="preserve"> </w:t>
       </w:r>
       <w:r>
-        <w:t xml:space="preserve">Schema-level, not behavioral type checking</w:t>
-      </w:r>
-    </w:p>
-    <w:bookmarkEnd w:id="36"/>
-    <w:bookmarkStart w:id="37" w:name="Xcc65fee624e5adf72d887a28de953e2aba38336"/>
+        <w:t xml:space="preserve">Schema-level, not behavioral type checking; single-agent only</w:t>
+      </w:r>
+    </w:p>
+    <w:bookmarkEnd w:id="37"/>
+    <w:bookmarkStart w:id="38" w:name="Xcc65fee624e5adf72d887a28de953e2aba38336"/>
     <w:p>
       <w:pPr>
         <w:pStyle w:val="Heading4"/>
       </w:pPr>
       <w:r>
-        <w:t xml:space="preserve">7.</w:t>
+        <w:t xml:space="preserve">8.</w:t>
       </w:r>
       <w:r>
         <w:t xml:space="preserve"> </w:t>
@@ -2018,7 +2186,7 @@
       <w:pPr>
         <w:numPr>
           <w:ilvl w:val="0"/>
-          <w:numId w:val="1012"/>
+          <w:numId w:val="1013"/>
         </w:numPr>
         <w:pStyle w:val="Compact"/>
       </w:pPr>
@@ -2040,7 +2208,7 @@
       <w:pPr>
         <w:numPr>
           <w:ilvl w:val="0"/>
-          <w:numId w:val="1012"/>
+          <w:numId w:val="1013"/>
         </w:numPr>
         <w:pStyle w:val="Compact"/>
       </w:pPr>
@@ -2062,7 +2230,7 @@
       <w:pPr>
         <w:numPr>
           <w:ilvl w:val="0"/>
-          <w:numId w:val="1012"/>
+          <w:numId w:val="1013"/>
         </w:numPr>
         <w:pStyle w:val="Compact"/>
       </w:pPr>
@@ -2077,7 +2245,7 @@
         <w:t xml:space="preserve"> </w:t>
       </w:r>
       <w:r>
-        <w:t xml:space="preserve">Identity verification, not behavioral type checking</w:t>
+        <w:t xml:space="preserve">Identity verification, not behavioral type checking; single-agent only</w:t>
       </w:r>
     </w:p>
     <w:p>
@@ -2087,9 +2255,9 @@
         </w:pict>
       </w:r>
     </w:p>
-    <w:bookmarkEnd w:id="37"/>
     <w:bookmarkEnd w:id="38"/>
-    <w:bookmarkStart w:id="39" w:name="what-is-missing-the-gap"/>
+    <w:bookmarkEnd w:id="39"/>
+    <w:bookmarkStart w:id="40" w:name="Xdebc21c39873ce77d8aef2a34172e0fec558ef0"/>
     <w:p>
       <w:pPr>
         <w:pStyle w:val="Heading3"/>
@@ -2111,7 +2279,7 @@
         <w:t xml:space="preserve"> </w:t>
       </w:r>
       <w:r>
-        <w:t xml:space="preserve">(The Gap)</w:t>
+        <w:t xml:space="preserve">(The Gap) — UPDATED with ZipperGen</w:t>
       </w:r>
     </w:p>
     <w:tbl>
@@ -2222,7 +2390,7 @@
                 <w:bCs/>
                 <w:b/>
               </w:rPr>
-              <w:t xml:space="preserve">Static behavioral type checking</w:t>
+              <w:t xml:space="preserve">Static behavioral type checking (single-agent)</w:t>
             </w:r>
           </w:p>
         </w:tc>
@@ -2264,31 +2432,83 @@
                 <w:bCs/>
                 <w:b/>
               </w:rPr>
-              <w:t xml:space="preserve">Protocol compatibility checking</w:t>
-            </w:r>
-          </w:p>
-        </w:tc>
-        <w:tc>
-          <w:tcPr/>
-          <w:p>
-            <w:pPr>
-              <w:pStyle w:val="Compact"/>
-              <w:jc w:val="left"/>
-            </w:pPr>
-            <w:r>
-              <w:t xml:space="preserve">❌ No</w:t>
-            </w:r>
-          </w:p>
-        </w:tc>
-        <w:tc>
-          <w:tcPr/>
-          <w:p>
-            <w:pPr>
-              <w:pStyle w:val="Compact"/>
-              <w:jc w:val="left"/>
-            </w:pPr>
-            <w:r>
-              <w:t xml:space="preserve">No MPST-style session type checking for multi-agent interactions</w:t>
+              <w:t xml:space="preserve">Static behavioral type checking (multi-agent)</w:t>
+            </w:r>
+          </w:p>
+        </w:tc>
+        <w:tc>
+          <w:tcPr/>
+          <w:p>
+            <w:pPr>
+              <w:pStyle w:val="Compact"/>
+              <w:jc w:val="left"/>
+            </w:pPr>
+            <w:r>
+              <w:t xml:space="preserve">⚠️ Partial</w:t>
+            </w:r>
+          </w:p>
+        </w:tc>
+        <w:tc>
+          <w:tcPr/>
+          <w:p>
+            <w:pPr>
+              <w:pStyle w:val="Compact"/>
+              <w:jc w:val="left"/>
+            </w:pPr>
+            <w:r>
+              <w:t xml:space="preserve">ZipperGen provides formal coordination structure checking, but not behavioral typing of message content</w:t>
+            </w:r>
+          </w:p>
+        </w:tc>
+      </w:tr>
+      <w:tr>
+        <w:tc>
+          <w:tcPr/>
+          <w:p>
+            <w:pPr>
+              <w:pStyle w:val="Compact"/>
+              <w:jc w:val="left"/>
+            </w:pPr>
+            <w:r>
+              <w:rPr>
+                <w:bCs/>
+                <w:b/>
+              </w:rPr>
+              <w:t xml:space="preserve">Protocol compatibility checking (multi-agent)</w:t>
+            </w:r>
+          </w:p>
+        </w:tc>
+        <w:tc>
+          <w:tcPr/>
+          <w:p>
+            <w:pPr>
+              <w:pStyle w:val="Compact"/>
+              <w:jc w:val="left"/>
+            </w:pPr>
+            <w:r>
+              <w:t xml:space="preserve">✅ Yes</w:t>
+            </w:r>
+          </w:p>
+        </w:tc>
+        <w:tc>
+          <w:tcPr/>
+          <w:p>
+            <w:pPr>
+              <w:pStyle w:val="Compact"/>
+              <w:jc w:val="left"/>
+            </w:pPr>
+            <w:r>
+              <w:rPr>
+                <w:bCs/>
+                <w:b/>
+              </w:rPr>
+              <w:t xml:space="preserve">ZipperGen</w:t>
+            </w:r>
+            <w:r>
+              <w:t xml:space="preserve"> </w:t>
+            </w:r>
+            <w:r>
+              <w:t xml:space="preserve">— MSC-based DSL with syntax-directed projection and well-typedness checks</w:t>
             </w:r>
           </w:p>
         </w:tc>
@@ -2318,19 +2538,29 @@
               <w:jc w:val="left"/>
             </w:pPr>
             <w:r>
-              <w:t xml:space="preserve">❌ No</w:t>
-            </w:r>
-          </w:p>
-        </w:tc>
-        <w:tc>
-          <w:tcPr/>
-          <w:p>
-            <w:pPr>
-              <w:pStyle w:val="Compact"/>
-              <w:jc w:val="left"/>
-            </w:pPr>
-            <w:r>
-              <w:t xml:space="preserve">Not addressed in any paper</w:t>
+              <w:t xml:space="preserve">✅ Yes</w:t>
+            </w:r>
+          </w:p>
+        </w:tc>
+        <w:tc>
+          <w:tcPr/>
+          <w:p>
+            <w:pPr>
+              <w:pStyle w:val="Compact"/>
+              <w:jc w:val="left"/>
+            </w:pPr>
+            <w:r>
+              <w:rPr>
+                <w:bCs/>
+                <w:b/>
+              </w:rPr>
+              <w:t xml:space="preserve">ZipperGen</w:t>
+            </w:r>
+            <w:r>
+              <w:t xml:space="preserve"> </w:t>
+            </w:r>
+            <w:r>
+              <w:t xml:space="preserve">— deadlock-free by construction from global specs</w:t>
             </w:r>
           </w:p>
         </w:tc>
@@ -2372,12 +2602,78 @@
               <w:jc w:val="left"/>
             </w:pPr>
             <w:r>
-              <w:t xml:space="preserve">No static analysis of how multiple skills compose</w:t>
+              <w:t xml:space="preserve">No static analysis of how multiple skills compose within a single agent</w:t>
             </w:r>
           </w:p>
         </w:tc>
       </w:tr>
     </w:tbl>
+    <w:p>
+      <w:pPr>
+        <w:pStyle w:val="BodyText"/>
+      </w:pPr>
+      <w:r>
+        <w:rPr>
+          <w:bCs/>
+          <w:b/>
+        </w:rPr>
+        <w:t xml:space="preserve">ZipperGen changes the picture:</w:t>
+      </w:r>
+      <w:r>
+        <w:t xml:space="preserve"> </w:t>
+      </w:r>
+      <w:r>
+        <w:t xml:space="preserve">Before ZipperGen, the answer was</w:t>
+      </w:r>
+      <w:r>
+        <w:t xml:space="preserve"> </w:t>
+      </w:r>
+      <w:r>
+        <w:t xml:space="preserve">“</w:t>
+      </w:r>
+      <w:r>
+        <w:t xml:space="preserve">no formal static checking for multi-agent interactions.</w:t>
+      </w:r>
+      <w:r>
+        <w:t xml:space="preserve">”</w:t>
+      </w:r>
+      <w:r>
+        <w:t xml:space="preserve"> </w:t>
+      </w:r>
+      <w:r>
+        <w:t xml:space="preserve">Now there is a concrete implementation (ZipperGen) that provides formal global specifications + guaranteed deadlock-free local programs. The gap is no longer</w:t>
+      </w:r>
+      <w:r>
+        <w:t xml:space="preserve"> </w:t>
+      </w:r>
+      <w:r>
+        <w:t xml:space="preserve">“</w:t>
+      </w:r>
+      <w:r>
+        <w:t xml:space="preserve">does this exist?</w:t>
+      </w:r>
+      <w:r>
+        <w:t xml:space="preserve">”</w:t>
+      </w:r>
+      <w:r>
+        <w:t xml:space="preserve"> </w:t>
+      </w:r>
+      <w:r>
+        <w:t xml:space="preserve">but</w:t>
+      </w:r>
+      <w:r>
+        <w:t xml:space="preserve"> </w:t>
+      </w:r>
+      <w:r>
+        <w:t xml:space="preserve">“</w:t>
+      </w:r>
+      <w:r>
+        <w:t xml:space="preserve">how do we extend this to skill content verification and behavioral typing?</w:t>
+      </w:r>
+      <w:r>
+        <w:t xml:space="preserve">”</w:t>
+      </w:r>
+    </w:p>
     <w:p>
       <w:r>
         <w:pict>
@@ -2385,8 +2681,8 @@
         </w:pict>
       </w:r>
     </w:p>
-    <w:bookmarkEnd w:id="39"/>
-    <w:bookmarkStart w:id="40" w:name="verdict-on-question-2"/>
+    <w:bookmarkEnd w:id="40"/>
+    <w:bookmarkStart w:id="41" w:name="verdict-on-question-2"/>
     <w:p>
       <w:pPr>
         <w:pStyle w:val="Heading3"/>
@@ -2404,7 +2700,7 @@
           <w:bCs/>
           <w:b/>
         </w:rPr>
-        <w:t xml:space="preserve">Static analysis exists (SkillFortify, SkCC) but is limited to code artifacts or structured representations. There is no formal type system for natural language skill descriptions, and no MPST-style static protocol checking for multi-agent interactions. This is a research gap.</w:t>
+        <w:t xml:space="preserve">ZipperGen is the breakthrough paper for multi-agent static coordination. It provides formal type checking (well-typedness), deadlock-free-by-construction guarantees, and syntax-directed projection — all before any agent runs. For single-agent skills, SkillFortify and SkCC provide formal static analysis. The remaining gap is behavioral typing of message content and automatic skill composition verification.</w:t>
       </w:r>
     </w:p>
     <w:p>
@@ -2414,9 +2710,9 @@
         </w:pict>
       </w:r>
     </w:p>
-    <w:bookmarkEnd w:id="40"/>
     <w:bookmarkEnd w:id="41"/>
-    <w:bookmarkStart w:id="57" w:name="X7180d2c2a2f74419f8b5d92768d779c842d335b"/>
+    <w:bookmarkEnd w:id="42"/>
+    <w:bookmarkStart w:id="59" w:name="X7180d2c2a2f74419f8b5d92768d779c842d335b"/>
     <w:p>
       <w:pPr>
         <w:pStyle w:val="Heading2"/>
@@ -2425,7 +2721,7 @@
         <w:t xml:space="preserve">Question 3: Runtime Checking in a Deterministic Way (Not LLM-as-Judge)?</w:t>
       </w:r>
     </w:p>
-    <w:bookmarkStart w:id="42" w:name="Xcfe9f3596c019c940ccb5c1507a2387120bc1f9"/>
+    <w:bookmarkStart w:id="43" w:name="X441778541a5007b9eea1b7f89351834d6c77986"/>
     <w:p>
       <w:pPr>
         <w:pStyle w:val="Heading3"/>
@@ -2441,7 +2737,7 @@
           <w:bCs/>
           <w:b/>
         </w:rPr>
-        <w:t xml:space="preserve">Yes — multiple deterministic runtime enforcement mechanisms exist, some formally verified.</w:t>
+        <w:t xml:space="preserve">Yes — and ZipperGen is the only multi-agent approach that deterministically enforces coordination structure.</w:t>
       </w:r>
     </w:p>
     <w:p>
@@ -2451,8 +2747,8 @@
         </w:pict>
       </w:r>
     </w:p>
-    <w:bookmarkEnd w:id="42"/>
-    <w:bookmarkStart w:id="53" w:name="X35d57ced75411806b2ff142f3613f747d9dadf1"/>
+    <w:bookmarkEnd w:id="43"/>
+    <w:bookmarkStart w:id="55" w:name="X35d57ced75411806b2ff142f3613f747d9dadf1"/>
     <w:p>
       <w:pPr>
         <w:pStyle w:val="Heading3"/>
@@ -2461,7 +2757,7 @@
         <w:t xml:space="preserve">Papers With Deterministic Runtime Enforcement</w:t>
       </w:r>
     </w:p>
-    <w:bookmarkStart w:id="43" w:name="X3fdc46b398d70ebaa7f1519d9f2ea3e61f5c932"/>
+    <w:bookmarkStart w:id="44" w:name="X8073a3ecff69552481dac2c748a685d6c87c1ff"/>
     <w:p>
       <w:pPr>
         <w:pStyle w:val="Heading4"/>
@@ -2477,6 +2773,228 @@
           <w:bCs/>
           <w:b/>
         </w:rPr>
+        <w:t xml:space="preserve">ZipperGen / Provable Coordination for LLM Agents via MSCs</w:t>
+      </w:r>
+      <w:r>
+        <w:t xml:space="preserve"> </w:t>
+      </w:r>
+      <w:r>
+        <w:t xml:space="preserve">(arXiv:2604.17612, Cross-layer Layer 0+1) —</w:t>
+      </w:r>
+      <w:r>
+        <w:t xml:space="preserve"> </w:t>
+      </w:r>
+      <w:r>
+        <w:rPr>
+          <w:bCs/>
+          <w:b/>
+        </w:rPr>
+        <w:t xml:space="preserve">Multi-Agent Coordination — Breakthrough</w:t>
+      </w:r>
+    </w:p>
+    <w:p>
+      <w:pPr>
+        <w:numPr>
+          <w:ilvl w:val="0"/>
+          <w:numId w:val="1014"/>
+        </w:numPr>
+        <w:pStyle w:val="Compact"/>
+      </w:pPr>
+      <w:r>
+        <w:rPr>
+          <w:bCs/>
+          <w:b/>
+        </w:rPr>
+        <w:t xml:space="preserve">Deterministic:</w:t>
+      </w:r>
+      <w:r>
+        <w:t xml:space="preserve"> </w:t>
+      </w:r>
+      <w:r>
+        <w:t xml:space="preserve">Yes — message-passing structure is formally specified and deterministically enforced; LLM actions remain opaque</w:t>
+      </w:r>
+    </w:p>
+    <w:p>
+      <w:pPr>
+        <w:numPr>
+          <w:ilvl w:val="0"/>
+          <w:numId w:val="1014"/>
+        </w:numPr>
+        <w:pStyle w:val="Compact"/>
+      </w:pPr>
+      <w:r>
+        <w:rPr>
+          <w:bCs/>
+          <w:b/>
+        </w:rPr>
+        <w:t xml:space="preserve">Mechanism:</w:t>
+      </w:r>
+      <w:r>
+        <w:t xml:space="preserve"> </w:t>
+      </w:r>
+      <w:r>
+        <w:t xml:space="preserve">Domain-specific language (DSL) based on Message Sequence Charts (MSCs). Syntax-directed projection generates local agent programs from global coordination specifications. Owned control flow with explicit deciders. Control broadcasts ensure non-owner lifelines observe branch choices.</w:t>
+      </w:r>
+    </w:p>
+    <w:p>
+      <w:pPr>
+        <w:numPr>
+          <w:ilvl w:val="0"/>
+          <w:numId w:val="1014"/>
+        </w:numPr>
+        <w:pStyle w:val="Compact"/>
+      </w:pPr>
+      <w:r>
+        <w:rPr>
+          <w:bCs/>
+          <w:b/>
+        </w:rPr>
+        <w:t xml:space="preserve">Key innovation:</w:t>
+      </w:r>
+      <w:r>
+        <w:t xml:space="preserve"> </w:t>
+      </w:r>
+      <w:r>
+        <w:t xml:space="preserve">The coordination structure (message passing, branch decisions, loops) is</w:t>
+      </w:r>
+      <w:r>
+        <w:t xml:space="preserve"> </w:t>
+      </w:r>
+      <w:r>
+        <w:rPr>
+          <w:bCs/>
+          <w:b/>
+        </w:rPr>
+        <w:t xml:space="preserve">guaranteed correct by construction</w:t>
+      </w:r>
+      <w:r>
+        <w:t xml:space="preserve"> </w:t>
+      </w:r>
+      <w:r>
+        <w:t xml:space="preserve">— deadlock-free, no message mismatches, no race conditions. The LLM actions inside the structure are opaque (unpredictable), but the</w:t>
+      </w:r>
+      <w:r>
+        <w:t xml:space="preserve"> </w:t>
+      </w:r>
+      <w:r>
+        <w:rPr>
+          <w:iCs/>
+          <w:i/>
+        </w:rPr>
+        <w:t xml:space="preserve">structure around them</w:t>
+      </w:r>
+      <w:r>
+        <w:t xml:space="preserve"> </w:t>
+      </w:r>
+      <w:r>
+        <w:t xml:space="preserve">is deterministic and formally verified.</w:t>
+      </w:r>
+    </w:p>
+    <w:p>
+      <w:pPr>
+        <w:numPr>
+          <w:ilvl w:val="0"/>
+          <w:numId w:val="1014"/>
+        </w:numPr>
+        <w:pStyle w:val="Compact"/>
+      </w:pPr>
+      <w:r>
+        <w:rPr>
+          <w:bCs/>
+          <w:b/>
+        </w:rPr>
+        <w:t xml:space="preserve">Runtime:</w:t>
+      </w:r>
+      <w:r>
+        <w:t xml:space="preserve"> </w:t>
+      </w:r>
+      <w:r>
+        <w:t xml:space="preserve">The projected local programs are deterministic finite-state programs that agents execute. No LLM-as-judge for coordination decisions.</w:t>
+      </w:r>
+    </w:p>
+    <w:p>
+      <w:pPr>
+        <w:numPr>
+          <w:ilvl w:val="0"/>
+          <w:numId w:val="1014"/>
+        </w:numPr>
+        <w:pStyle w:val="Compact"/>
+      </w:pPr>
+      <w:r>
+        <w:rPr>
+          <w:bCs/>
+          <w:b/>
+        </w:rPr>
+        <w:t xml:space="preserve">Results:</w:t>
+      </w:r>
+      <w:r>
+        <w:t xml:space="preserve"> </w:t>
+      </w:r>
+      <w:r>
+        <w:t xml:space="preserve">Deadlock-free by construction. Coordination properties established independently of LLM nondeterminism. Runtime planning extension: LLM dynamically generates coordination workflows with same structural guarantees.</w:t>
+      </w:r>
+    </w:p>
+    <w:p>
+      <w:pPr>
+        <w:numPr>
+          <w:ilvl w:val="0"/>
+          <w:numId w:val="1014"/>
+        </w:numPr>
+        <w:pStyle w:val="Compact"/>
+      </w:pPr>
+      <w:r>
+        <w:rPr>
+          <w:bCs/>
+          <w:b/>
+        </w:rPr>
+        <w:t xml:space="preserve">Open source:</w:t>
+      </w:r>
+      <w:r>
+        <w:t xml:space="preserve"> </w:t>
+      </w:r>
+      <w:r>
+        <w:t xml:space="preserve">ZipperGen — https://zippergen.io</w:t>
+      </w:r>
+    </w:p>
+    <w:p>
+      <w:pPr>
+        <w:numPr>
+          <w:ilvl w:val="0"/>
+          <w:numId w:val="1014"/>
+        </w:numPr>
+        <w:pStyle w:val="Compact"/>
+      </w:pPr>
+      <w:r>
+        <w:rPr>
+          <w:bCs/>
+          <w:b/>
+        </w:rPr>
+        <w:t xml:space="preserve">Gap:</w:t>
+      </w:r>
+      <w:r>
+        <w:t xml:space="preserve"> </w:t>
+      </w:r>
+      <w:r>
+        <w:t xml:space="preserve">Does not verify LLM action content (opaque by design). No runtime behavioral enforcement of what agents actually do inside action blocks.</w:t>
+      </w:r>
+    </w:p>
+    <w:bookmarkEnd w:id="44"/>
+    <w:bookmarkStart w:id="45" w:name="X2caffe3209fa712eb5b8f5ba62d2a18ba404614"/>
+    <w:p>
+      <w:pPr>
+        <w:pStyle w:val="Heading4"/>
+      </w:pPr>
+      <w:r>
+        <w:t xml:space="preserve">2.</w:t>
+      </w:r>
+      <w:r>
+        <w:t xml:space="preserve"> </w:t>
+      </w:r>
+      <w:r>
+        <w:rPr>
+          <w:bCs/>
+          <w:b/>
+        </w:rPr>
         <w:t xml:space="preserve">ACP — Admission Control Protocol</w:t>
       </w:r>
       <w:r>
@@ -2493,14 +3011,14 @@
           <w:bCs/>
           <w:b/>
         </w:rPr>
-        <w:t xml:space="preserve">Fastest + Formally Verified</w:t>
-      </w:r>
-    </w:p>
-    <w:p>
-      <w:pPr>
-        <w:numPr>
-          <w:ilvl w:val="0"/>
-          <w:numId w:val="1013"/>
+        <w:t xml:space="preserve">Fastest Single-Agent + Formally Verified</w:t>
+      </w:r>
+    </w:p>
+    <w:p>
+      <w:pPr>
+        <w:numPr>
+          <w:ilvl w:val="0"/>
+          <w:numId w:val="1015"/>
         </w:numPr>
         <w:pStyle w:val="Compact"/>
       </w:pPr>
@@ -2522,7 +3040,7 @@
       <w:pPr>
         <w:numPr>
           <w:ilvl w:val="0"/>
-          <w:numId w:val="1013"/>
+          <w:numId w:val="1015"/>
         </w:numPr>
         <w:pStyle w:val="Compact"/>
       </w:pPr>
@@ -2544,7 +3062,7 @@
       <w:pPr>
         <w:numPr>
           <w:ilvl w:val="0"/>
-          <w:numId w:val="1013"/>
+          <w:numId w:val="1015"/>
         </w:numPr>
         <w:pStyle w:val="Compact"/>
       </w:pPr>
@@ -2566,7 +3084,7 @@
       <w:pPr>
         <w:numPr>
           <w:ilvl w:val="0"/>
-          <w:numId w:val="1013"/>
+          <w:numId w:val="1015"/>
         </w:numPr>
         <w:pStyle w:val="Compact"/>
       </w:pPr>
@@ -2588,7 +3106,7 @@
       <w:pPr>
         <w:numPr>
           <w:ilvl w:val="0"/>
-          <w:numId w:val="1013"/>
+          <w:numId w:val="1015"/>
         </w:numPr>
         <w:pStyle w:val="Compact"/>
       </w:pPr>
@@ -2610,7 +3128,7 @@
       <w:pPr>
         <w:numPr>
           <w:ilvl w:val="0"/>
-          <w:numId w:val="1013"/>
+          <w:numId w:val="1015"/>
         </w:numPr>
         <w:pStyle w:val="Compact"/>
       </w:pPr>
@@ -2632,7 +3150,7 @@
       <w:pPr>
         <w:numPr>
           <w:ilvl w:val="0"/>
-          <w:numId w:val="1013"/>
+          <w:numId w:val="1015"/>
         </w:numPr>
         <w:pStyle w:val="Compact"/>
       </w:pPr>
@@ -2650,14 +3168,14 @@
         <w:t xml:space="preserve">1 of 6-paper Agent Governance Series (Marcelo Fernandez)</w:t>
       </w:r>
     </w:p>
-    <w:bookmarkEnd w:id="43"/>
-    <w:bookmarkStart w:id="44" w:name="X5986eb250730ab32f80e7086ca684f0c8f5a62b"/>
+    <w:bookmarkEnd w:id="45"/>
+    <w:bookmarkStart w:id="46" w:name="Xd49fa68ef0b3d2a85530a73247fbb0004715fde"/>
     <w:p>
       <w:pPr>
         <w:pStyle w:val="Heading4"/>
       </w:pPr>
       <w:r>
-        <w:t xml:space="preserve">2.</w:t>
+        <w:t xml:space="preserve">3.</w:t>
       </w:r>
       <w:r>
         <w:t xml:space="preserve"> </w:t>
@@ -2683,14 +3201,14 @@
           <w:bCs/>
           <w:b/>
         </w:rPr>
-        <w:t xml:space="preserve">Most Comprehensive</w:t>
-      </w:r>
-    </w:p>
-    <w:p>
-      <w:pPr>
-        <w:numPr>
-          <w:ilvl w:val="0"/>
-          <w:numId w:val="1014"/>
+        <w:t xml:space="preserve">Most Comprehensive Single-Agent</w:t>
+      </w:r>
+    </w:p>
+    <w:p>
+      <w:pPr>
+        <w:numPr>
+          <w:ilvl w:val="0"/>
+          <w:numId w:val="1016"/>
         </w:numPr>
         <w:pStyle w:val="Compact"/>
       </w:pPr>
@@ -2712,7 +3230,7 @@
       <w:pPr>
         <w:numPr>
           <w:ilvl w:val="0"/>
-          <w:numId w:val="1014"/>
+          <w:numId w:val="1016"/>
         </w:numPr>
         <w:pStyle w:val="Compact"/>
       </w:pPr>
@@ -2734,7 +3252,7 @@
       <w:pPr>
         <w:numPr>
           <w:ilvl w:val="0"/>
-          <w:numId w:val="1014"/>
+          <w:numId w:val="1016"/>
         </w:numPr>
         <w:pStyle w:val="Compact"/>
       </w:pPr>
@@ -2756,7 +3274,7 @@
       <w:pPr>
         <w:numPr>
           <w:ilvl w:val="0"/>
-          <w:numId w:val="1014"/>
+          <w:numId w:val="1016"/>
         </w:numPr>
         <w:pStyle w:val="Compact"/>
       </w:pPr>
@@ -2778,7 +3296,7 @@
       <w:pPr>
         <w:numPr>
           <w:ilvl w:val="0"/>
-          <w:numId w:val="1014"/>
+          <w:numId w:val="1016"/>
         </w:numPr>
         <w:pStyle w:val="Compact"/>
       </w:pPr>
@@ -2800,7 +3318,7 @@
       <w:pPr>
         <w:numPr>
           <w:ilvl w:val="0"/>
-          <w:numId w:val="1014"/>
+          <w:numId w:val="1016"/>
         </w:numPr>
         <w:pStyle w:val="Compact"/>
       </w:pPr>
@@ -2822,7 +3340,7 @@
       <w:pPr>
         <w:numPr>
           <w:ilvl w:val="0"/>
-          <w:numId w:val="1014"/>
+          <w:numId w:val="1016"/>
         </w:numPr>
         <w:pStyle w:val="Compact"/>
       </w:pPr>
@@ -2837,17 +3355,17 @@
         <w:t xml:space="preserve"> </w:t>
       </w:r>
       <w:r>
-        <w:t xml:space="preserve">Contracts are probabilistically satisfied, not 100% deterministic</w:t>
-      </w:r>
-    </w:p>
-    <w:bookmarkEnd w:id="44"/>
-    <w:bookmarkStart w:id="45" w:name="X3c90a03d1b6b27ca6db87ec25b43405e1379225"/>
+        <w:t xml:space="preserve">Contracts are probabilistically satisfied, not 100% deterministic; single-agent only</w:t>
+      </w:r>
+    </w:p>
+    <w:bookmarkEnd w:id="46"/>
+    <w:bookmarkStart w:id="47" w:name="X26dd61d8e09fd7029e2c33779859bf44fda04fa"/>
     <w:p>
       <w:pPr>
         <w:pStyle w:val="Heading4"/>
       </w:pPr>
       <w:r>
-        <w:t xml:space="preserve">3.</w:t>
+        <w:t xml:space="preserve">4.</w:t>
       </w:r>
       <w:r>
         <w:t xml:space="preserve"> </w:t>
@@ -2873,14 +3391,14 @@
           <w:bCs/>
           <w:b/>
         </w:rPr>
-        <w:t xml:space="preserve">Most Expressive</w:t>
-      </w:r>
-    </w:p>
-    <w:p>
-      <w:pPr>
-        <w:numPr>
-          <w:ilvl w:val="0"/>
-          <w:numId w:val="1015"/>
+        <w:t xml:space="preserve">Most Expressive Single-Agent</w:t>
+      </w:r>
+    </w:p>
+    <w:p>
+      <w:pPr>
+        <w:numPr>
+          <w:ilvl w:val="0"/>
+          <w:numId w:val="1017"/>
         </w:numPr>
         <w:pStyle w:val="Compact"/>
       </w:pPr>
@@ -2902,7 +3420,7 @@
       <w:pPr>
         <w:numPr>
           <w:ilvl w:val="0"/>
-          <w:numId w:val="1015"/>
+          <w:numId w:val="1017"/>
         </w:numPr>
         <w:pStyle w:val="Compact"/>
       </w:pPr>
@@ -2924,7 +3442,7 @@
       <w:pPr>
         <w:numPr>
           <w:ilvl w:val="0"/>
-          <w:numId w:val="1015"/>
+          <w:numId w:val="1017"/>
         </w:numPr>
         <w:pStyle w:val="Compact"/>
       </w:pPr>
@@ -2946,7 +3464,7 @@
       <w:pPr>
         <w:numPr>
           <w:ilvl w:val="0"/>
-          <w:numId w:val="1015"/>
+          <w:numId w:val="1017"/>
         </w:numPr>
         <w:pStyle w:val="Compact"/>
       </w:pPr>
@@ -2968,7 +3486,7 @@
       <w:pPr>
         <w:numPr>
           <w:ilvl w:val="0"/>
-          <w:numId w:val="1015"/>
+          <w:numId w:val="1017"/>
         </w:numPr>
         <w:pStyle w:val="Compact"/>
       </w:pPr>
@@ -2983,17 +3501,17 @@
         <w:t xml:space="preserve"> </w:t>
       </w:r>
       <w:r>
-        <w:t xml:space="preserve">Proposed framework, not yet evaluated at scale</w:t>
-      </w:r>
-    </w:p>
-    <w:bookmarkEnd w:id="45"/>
-    <w:bookmarkStart w:id="46" w:name="X3e363c82dc71b02aec74f8cbe07f337be6b4c44"/>
+        <w:t xml:space="preserve">Proposed framework, not yet evaluated at scale; single-agent only</w:t>
+      </w:r>
+    </w:p>
+    <w:bookmarkEnd w:id="47"/>
+    <w:bookmarkStart w:id="48" w:name="X3e363c82dc71b02aec74f8cbe07f337be6b4c44"/>
     <w:p>
       <w:pPr>
         <w:pStyle w:val="Heading4"/>
       </w:pPr>
       <w:r>
-        <w:t xml:space="preserve">4.</w:t>
+        <w:t xml:space="preserve">5.</w:t>
       </w:r>
       <w:r>
         <w:t xml:space="preserve"> </w:t>
@@ -3016,7 +3534,7 @@
       <w:pPr>
         <w:numPr>
           <w:ilvl w:val="0"/>
-          <w:numId w:val="1016"/>
+          <w:numId w:val="1018"/>
         </w:numPr>
         <w:pStyle w:val="Compact"/>
       </w:pPr>
@@ -3038,7 +3556,7 @@
       <w:pPr>
         <w:numPr>
           <w:ilvl w:val="0"/>
-          <w:numId w:val="1016"/>
+          <w:numId w:val="1018"/>
         </w:numPr>
         <w:pStyle w:val="Compact"/>
       </w:pPr>
@@ -3060,7 +3578,7 @@
       <w:pPr>
         <w:numPr>
           <w:ilvl w:val="0"/>
-          <w:numId w:val="1016"/>
+          <w:numId w:val="1018"/>
         </w:numPr>
         <w:pStyle w:val="Compact"/>
       </w:pPr>
@@ -3082,7 +3600,7 @@
       <w:pPr>
         <w:numPr>
           <w:ilvl w:val="0"/>
-          <w:numId w:val="1016"/>
+          <w:numId w:val="1018"/>
         </w:numPr>
         <w:pStyle w:val="Compact"/>
       </w:pPr>
@@ -3097,17 +3615,17 @@
         <w:t xml:space="preserve"> </w:t>
       </w:r>
       <w:r>
-        <w:t xml:space="preserve">Hybrid architecture, not purely deterministic runtime</w:t>
-      </w:r>
-    </w:p>
-    <w:bookmarkEnd w:id="46"/>
-    <w:bookmarkStart w:id="47" w:name="sentinelagent-arxiv2604.02767-layer-1"/>
+        <w:t xml:space="preserve">Hybrid architecture, not purely deterministic runtime; single-agent only</w:t>
+      </w:r>
+    </w:p>
+    <w:bookmarkEnd w:id="48"/>
+    <w:bookmarkStart w:id="49" w:name="sentinelagent-arxiv2604.02767-layer-1"/>
     <w:p>
       <w:pPr>
         <w:pStyle w:val="Heading4"/>
       </w:pPr>
       <w:r>
-        <w:t xml:space="preserve">5.</w:t>
+        <w:t xml:space="preserve">6.</w:t>
       </w:r>
       <w:r>
         <w:t xml:space="preserve"> </w:t>
@@ -3130,7 +3648,7 @@
       <w:pPr>
         <w:numPr>
           <w:ilvl w:val="0"/>
-          <w:numId w:val="1017"/>
+          <w:numId w:val="1019"/>
         </w:numPr>
         <w:pStyle w:val="Compact"/>
       </w:pPr>
@@ -3152,7 +3670,7 @@
       <w:pPr>
         <w:numPr>
           <w:ilvl w:val="0"/>
-          <w:numId w:val="1017"/>
+          <w:numId w:val="1019"/>
         </w:numPr>
         <w:pStyle w:val="Compact"/>
       </w:pPr>
@@ -3174,7 +3692,7 @@
       <w:pPr>
         <w:numPr>
           <w:ilvl w:val="0"/>
-          <w:numId w:val="1017"/>
+          <w:numId w:val="1019"/>
         </w:numPr>
         <w:pStyle w:val="Compact"/>
       </w:pPr>
@@ -3196,7 +3714,7 @@
       <w:pPr>
         <w:numPr>
           <w:ilvl w:val="0"/>
-          <w:numId w:val="1017"/>
+          <w:numId w:val="1019"/>
         </w:numPr>
         <w:pStyle w:val="Compact"/>
       </w:pPr>
@@ -3218,7 +3736,7 @@
       <w:pPr>
         <w:numPr>
           <w:ilvl w:val="0"/>
-          <w:numId w:val="1017"/>
+          <w:numId w:val="1019"/>
         </w:numPr>
         <w:pStyle w:val="Compact"/>
       </w:pPr>
@@ -3233,17 +3751,17 @@
         <w:t xml:space="preserve"> </w:t>
       </w:r>
       <w:r>
-        <w:t xml:space="preserve">Focused on delegation chains, not general skill execution</w:t>
-      </w:r>
-    </w:p>
-    <w:bookmarkEnd w:id="47"/>
-    <w:bookmarkStart w:id="48" w:name="X47b6c1fc29e5b0e1355d6d2f8c04d515593b86d"/>
+        <w:t xml:space="preserve">Focused on delegation chains, not general skill execution; single-agent only</w:t>
+      </w:r>
+    </w:p>
+    <w:bookmarkEnd w:id="49"/>
+    <w:bookmarkStart w:id="50" w:name="X47b6c1fc29e5b0e1355d6d2f8c04d515593b86d"/>
     <w:p>
       <w:pPr>
         <w:pStyle w:val="Heading4"/>
       </w:pPr>
       <w:r>
-        <w:t xml:space="preserve">6.</w:t>
+        <w:t xml:space="preserve">7.</w:t>
       </w:r>
       <w:r>
         <w:t xml:space="preserve"> </w:t>
@@ -3266,7 +3784,7 @@
       <w:pPr>
         <w:numPr>
           <w:ilvl w:val="0"/>
-          <w:numId w:val="1018"/>
+          <w:numId w:val="1020"/>
         </w:numPr>
         <w:pStyle w:val="Compact"/>
       </w:pPr>
@@ -3288,7 +3806,7 @@
       <w:pPr>
         <w:numPr>
           <w:ilvl w:val="0"/>
-          <w:numId w:val="1018"/>
+          <w:numId w:val="1020"/>
         </w:numPr>
         <w:pStyle w:val="Compact"/>
       </w:pPr>
@@ -3310,7 +3828,7 @@
       <w:pPr>
         <w:numPr>
           <w:ilvl w:val="0"/>
-          <w:numId w:val="1018"/>
+          <w:numId w:val="1020"/>
         </w:numPr>
         <w:pStyle w:val="Compact"/>
       </w:pPr>
@@ -3332,7 +3850,7 @@
       <w:pPr>
         <w:numPr>
           <w:ilvl w:val="0"/>
-          <w:numId w:val="1018"/>
+          <w:numId w:val="1020"/>
         </w:numPr>
         <w:pStyle w:val="Compact"/>
       </w:pPr>
@@ -3347,17 +3865,17 @@
         <w:t xml:space="preserve"> </w:t>
       </w:r>
       <w:r>
-        <w:t xml:space="preserve">Complex to implement; requires trace instrumentation</w:t>
-      </w:r>
-    </w:p>
-    <w:bookmarkEnd w:id="48"/>
-    <w:bookmarkStart w:id="49" w:name="X6018fad9ce1a525b97c3910e80bf95f04ca82d1"/>
+        <w:t xml:space="preserve">Complex to implement; requires trace instrumentation; single-agent only</w:t>
+      </w:r>
+    </w:p>
+    <w:bookmarkEnd w:id="50"/>
+    <w:bookmarkStart w:id="51" w:name="X6018fad9ce1a525b97c3910e80bf95f04ca82d1"/>
     <w:p>
       <w:pPr>
         <w:pStyle w:val="Heading4"/>
       </w:pPr>
       <w:r>
-        <w:t xml:space="preserve">7.</w:t>
+        <w:t xml:space="preserve">8.</w:t>
       </w:r>
       <w:r>
         <w:t xml:space="preserve"> </w:t>
@@ -3380,7 +3898,7 @@
       <w:pPr>
         <w:numPr>
           <w:ilvl w:val="0"/>
-          <w:numId w:val="1019"/>
+          <w:numId w:val="1021"/>
         </w:numPr>
         <w:pStyle w:val="Compact"/>
       </w:pPr>
@@ -3402,7 +3920,7 @@
       <w:pPr>
         <w:numPr>
           <w:ilvl w:val="0"/>
-          <w:numId w:val="1019"/>
+          <w:numId w:val="1021"/>
         </w:numPr>
         <w:pStyle w:val="Compact"/>
       </w:pPr>
@@ -3424,7 +3942,7 @@
       <w:pPr>
         <w:numPr>
           <w:ilvl w:val="0"/>
-          <w:numId w:val="1019"/>
+          <w:numId w:val="1021"/>
         </w:numPr>
         <w:pStyle w:val="Compact"/>
       </w:pPr>
@@ -3446,7 +3964,7 @@
       <w:pPr>
         <w:numPr>
           <w:ilvl w:val="0"/>
-          <w:numId w:val="1019"/>
+          <w:numId w:val="1021"/>
         </w:numPr>
         <w:pStyle w:val="Compact"/>
       </w:pPr>
@@ -3461,17 +3979,17 @@
         <w:t xml:space="preserve"> </w:t>
       </w:r>
       <w:r>
-        <w:t xml:space="preserve">Architectural framework, not a specific implementation</w:t>
-      </w:r>
-    </w:p>
-    <w:bookmarkEnd w:id="49"/>
-    <w:bookmarkStart w:id="50" w:name="X3516cc4bc4fb08ea4fcc6aa8b5424b9c8e889ee"/>
+        <w:t xml:space="preserve">Architectural framework, not a specific implementation; single-agent only</w:t>
+      </w:r>
+    </w:p>
+    <w:bookmarkEnd w:id="51"/>
+    <w:bookmarkStart w:id="52" w:name="X3516cc4bc4fb08ea4fcc6aa8b5424b9c8e889ee"/>
     <w:p>
       <w:pPr>
         <w:pStyle w:val="Heading4"/>
       </w:pPr>
       <w:r>
-        <w:t xml:space="preserve">8.</w:t>
+        <w:t xml:space="preserve">9.</w:t>
       </w:r>
       <w:r>
         <w:t xml:space="preserve"> </w:t>
@@ -3494,7 +4012,7 @@
       <w:pPr>
         <w:numPr>
           <w:ilvl w:val="0"/>
-          <w:numId w:val="1020"/>
+          <w:numId w:val="1022"/>
         </w:numPr>
         <w:pStyle w:val="Compact"/>
       </w:pPr>
@@ -3516,7 +4034,7 @@
       <w:pPr>
         <w:numPr>
           <w:ilvl w:val="0"/>
-          <w:numId w:val="1020"/>
+          <w:numId w:val="1022"/>
         </w:numPr>
         <w:pStyle w:val="Compact"/>
       </w:pPr>
@@ -3538,7 +4056,7 @@
       <w:pPr>
         <w:numPr>
           <w:ilvl w:val="0"/>
-          <w:numId w:val="1020"/>
+          <w:numId w:val="1022"/>
         </w:numPr>
         <w:pStyle w:val="Compact"/>
       </w:pPr>
@@ -3556,14 +4074,14 @@
         <w:t xml:space="preserve">No runtime enforcement mechanism</w:t>
       </w:r>
     </w:p>
-    <w:bookmarkEnd w:id="50"/>
-    <w:bookmarkStart w:id="51" w:name="nist-ir-8596-dec-2025-layer-12"/>
+    <w:bookmarkEnd w:id="52"/>
+    <w:bookmarkStart w:id="53" w:name="nist-ir-8596-dec-2025-layer-12"/>
     <w:p>
       <w:pPr>
         <w:pStyle w:val="Heading4"/>
       </w:pPr>
       <w:r>
-        <w:t xml:space="preserve">9.</w:t>
+        <w:t xml:space="preserve">10.</w:t>
       </w:r>
       <w:r>
         <w:t xml:space="preserve"> </w:t>
@@ -3586,7 +4104,7 @@
       <w:pPr>
         <w:numPr>
           <w:ilvl w:val="0"/>
-          <w:numId w:val="1021"/>
+          <w:numId w:val="1023"/>
         </w:numPr>
         <w:pStyle w:val="Compact"/>
       </w:pPr>
@@ -3608,7 +4126,7 @@
       <w:pPr>
         <w:numPr>
           <w:ilvl w:val="0"/>
-          <w:numId w:val="1021"/>
+          <w:numId w:val="1023"/>
         </w:numPr>
         <w:pStyle w:val="Compact"/>
       </w:pPr>
@@ -3633,8 +4151,8 @@
         </w:pict>
       </w:r>
     </w:p>
-    <w:bookmarkEnd w:id="51"/>
-    <w:bookmarkStart w:id="52" w:name="X80474372f33bebeca79d59424e11d06222a4f95"/>
+    <w:bookmarkEnd w:id="53"/>
+    <w:bookmarkStart w:id="54" w:name="X80474372f33bebeca79d59424e11d06222a4f95"/>
     <w:p>
       <w:pPr>
         <w:pStyle w:val="Heading4"/>
@@ -3663,7 +4181,7 @@
       <w:pPr>
         <w:numPr>
           <w:ilvl w:val="0"/>
-          <w:numId w:val="1022"/>
+          <w:numId w:val="1024"/>
         </w:numPr>
         <w:pStyle w:val="Compact"/>
       </w:pPr>
@@ -3685,7 +4203,7 @@
       <w:pPr>
         <w:numPr>
           <w:ilvl w:val="0"/>
-          <w:numId w:val="1022"/>
+          <w:numId w:val="1024"/>
         </w:numPr>
         <w:pStyle w:val="Compact"/>
       </w:pPr>
@@ -3707,7 +4225,7 @@
       <w:pPr>
         <w:numPr>
           <w:ilvl w:val="0"/>
-          <w:numId w:val="1022"/>
+          <w:numId w:val="1024"/>
         </w:numPr>
         <w:pStyle w:val="Compact"/>
       </w:pPr>
@@ -3729,7 +4247,7 @@
       <w:pPr>
         <w:numPr>
           <w:ilvl w:val="0"/>
-          <w:numId w:val="1022"/>
+          <w:numId w:val="1024"/>
         </w:numPr>
         <w:pStyle w:val="Compact"/>
       </w:pPr>
@@ -3751,7 +4269,7 @@
       <w:pPr>
         <w:numPr>
           <w:ilvl w:val="0"/>
-          <w:numId w:val="1022"/>
+          <w:numId w:val="1024"/>
         </w:numPr>
         <w:pStyle w:val="Compact"/>
       </w:pPr>
@@ -3776,9 +4294,9 @@
         </w:pict>
       </w:r>
     </w:p>
-    <w:bookmarkEnd w:id="52"/>
-    <w:bookmarkEnd w:id="53"/>
-    <w:bookmarkStart w:id="54" w:name="Xbe24b76ee5dd84a10ed4cfa602ccbb90704f1ec"/>
+    <w:bookmarkEnd w:id="54"/>
+    <w:bookmarkEnd w:id="55"/>
+    <w:bookmarkStart w:id="56" w:name="Xbe24b76ee5dd84a10ed4cfa602ccbb90704f1ec"/>
     <w:p>
       <w:pPr>
         <w:pStyle w:val="Heading3"/>
@@ -3795,11 +4313,12 @@
         <w:jc w:val="start"/>
       </w:tblPr>
       <w:tblGrid>
-        <w:gridCol w:w="1210"/>
-        <w:gridCol w:w="1650"/>
-        <w:gridCol w:w="770"/>
-        <w:gridCol w:w="2310"/>
-        <w:gridCol w:w="1980"/>
+        <w:gridCol w:w="1102"/>
+        <w:gridCol w:w="701"/>
+        <w:gridCol w:w="1503"/>
+        <w:gridCol w:w="701"/>
+        <w:gridCol w:w="2105"/>
+        <w:gridCol w:w="1804"/>
       </w:tblGrid>
       <w:tr>
         <w:trPr>
@@ -3825,6 +4344,18 @@
               <w:jc w:val="left"/>
             </w:pPr>
             <w:r>
+              <w:t xml:space="preserve">Scope</w:t>
+            </w:r>
+          </w:p>
+        </w:tc>
+        <w:tc>
+          <w:tcPr/>
+          <w:p>
+            <w:pPr>
+              <w:pStyle w:val="Compact"/>
+              <w:jc w:val="left"/>
+            </w:pPr>
+            <w:r>
               <w:t xml:space="preserve">Deterministic?</w:t>
             </w:r>
           </w:p>
@@ -3862,6 +4393,88 @@
             </w:pPr>
             <w:r>
               <w:t xml:space="preserve">Production Ready</w:t>
+            </w:r>
+          </w:p>
+        </w:tc>
+      </w:tr>
+      <w:tr>
+        <w:tc>
+          <w:tcPr/>
+          <w:p>
+            <w:pPr>
+              <w:pStyle w:val="Compact"/>
+              <w:jc w:val="left"/>
+            </w:pPr>
+            <w:r>
+              <w:rPr>
+                <w:bCs/>
+                <w:b/>
+              </w:rPr>
+              <w:t xml:space="preserve">ZipperGen</w:t>
+            </w:r>
+          </w:p>
+        </w:tc>
+        <w:tc>
+          <w:tcPr/>
+          <w:p>
+            <w:pPr>
+              <w:pStyle w:val="Compact"/>
+              <w:jc w:val="left"/>
+            </w:pPr>
+            <w:r>
+              <w:rPr>
+                <w:bCs/>
+                <w:b/>
+              </w:rPr>
+              <w:t xml:space="preserve">Multi-agent</w:t>
+            </w:r>
+          </w:p>
+        </w:tc>
+        <w:tc>
+          <w:tcPr/>
+          <w:p>
+            <w:pPr>
+              <w:pStyle w:val="Compact"/>
+              <w:jc w:val="left"/>
+            </w:pPr>
+            <w:r>
+              <w:t xml:space="preserve">✅ Yes (coordination structure)</w:t>
+            </w:r>
+          </w:p>
+        </w:tc>
+        <w:tc>
+          <w:tcPr/>
+          <w:p>
+            <w:pPr>
+              <w:pStyle w:val="Compact"/>
+              <w:jc w:val="left"/>
+            </w:pPr>
+            <w:r>
+              <w:t xml:space="preserve">—</w:t>
+            </w:r>
+          </w:p>
+        </w:tc>
+        <w:tc>
+          <w:tcPr/>
+          <w:p>
+            <w:pPr>
+              <w:pStyle w:val="Compact"/>
+              <w:jc w:val="left"/>
+            </w:pPr>
+            <w:r>
+              <w:t xml:space="preserve">Structural induction proof</w:t>
+            </w:r>
+          </w:p>
+        </w:tc>
+        <w:tc>
+          <w:tcPr/>
+          <w:p>
+            <w:pPr>
+              <w:pStyle w:val="Compact"/>
+              <w:jc w:val="left"/>
+            </w:pPr>
+            <w:r>
+              <w:t xml:space="preserve">✅ Python impl</w:t>
             </w:r>
           </w:p>
         </w:tc>
@@ -3891,6 +4504,18 @@
               <w:jc w:val="left"/>
             </w:pPr>
             <w:r>
+              <w:t xml:space="preserve">Single-agent</w:t>
+            </w:r>
+          </w:p>
+        </w:tc>
+        <w:tc>
+          <w:tcPr/>
+          <w:p>
+            <w:pPr>
+              <w:pStyle w:val="Compact"/>
+              <w:jc w:val="left"/>
+            </w:pPr>
+            <w:r>
               <w:t xml:space="preserve">✅ Yes</w:t>
             </w:r>
           </w:p>
@@ -3957,6 +4582,18 @@
               <w:jc w:val="left"/>
             </w:pPr>
             <w:r>
+              <w:t xml:space="preserve">Single-agent</w:t>
+            </w:r>
+          </w:p>
+        </w:tc>
+        <w:tc>
+          <w:tcPr/>
+          <w:p>
+            <w:pPr>
+              <w:pStyle w:val="Compact"/>
+              <w:jc w:val="left"/>
+            </w:pPr>
+            <w:r>
               <w:t xml:space="preserve">✅ Mostly</w:t>
             </w:r>
           </w:p>
@@ -4023,6 +4660,18 @@
               <w:jc w:val="left"/>
             </w:pPr>
             <w:r>
+              <w:t xml:space="preserve">Single-agent</w:t>
+            </w:r>
+          </w:p>
+        </w:tc>
+        <w:tc>
+          <w:tcPr/>
+          <w:p>
+            <w:pPr>
+              <w:pStyle w:val="Compact"/>
+              <w:jc w:val="left"/>
+            </w:pPr>
+            <w:r>
               <w:t xml:space="preserve">✅ Yes</w:t>
             </w:r>
           </w:p>
@@ -4089,6 +4738,18 @@
               <w:jc w:val="left"/>
             </w:pPr>
             <w:r>
+              <w:t xml:space="preserve">Single-agent</w:t>
+            </w:r>
+          </w:p>
+        </w:tc>
+        <w:tc>
+          <w:tcPr/>
+          <w:p>
+            <w:pPr>
+              <w:pStyle w:val="Compact"/>
+              <w:jc w:val="left"/>
+            </w:pPr>
+            <w:r>
               <w:t xml:space="preserve">⚠️ Hybrid</w:t>
             </w:r>
           </w:p>
@@ -4155,6 +4816,18 @@
               <w:jc w:val="left"/>
             </w:pPr>
             <w:r>
+              <w:t xml:space="preserve">Single-agent</w:t>
+            </w:r>
+          </w:p>
+        </w:tc>
+        <w:tc>
+          <w:tcPr/>
+          <w:p>
+            <w:pPr>
+              <w:pStyle w:val="Compact"/>
+              <w:jc w:val="left"/>
+            </w:pPr>
+            <w:r>
               <w:t xml:space="preserve">✅ Yes</w:t>
             </w:r>
           </w:p>
@@ -4221,6 +4894,18 @@
               <w:jc w:val="left"/>
             </w:pPr>
             <w:r>
+              <w:t xml:space="preserve">Single-agent</w:t>
+            </w:r>
+          </w:p>
+        </w:tc>
+        <w:tc>
+          <w:tcPr/>
+          <w:p>
+            <w:pPr>
+              <w:pStyle w:val="Compact"/>
+              <w:jc w:val="left"/>
+            </w:pPr>
+            <w:r>
               <w:t xml:space="preserve">✅ Yes</w:t>
             </w:r>
           </w:p>
@@ -4287,6 +4972,18 @@
               <w:jc w:val="left"/>
             </w:pPr>
             <w:r>
+              <w:t xml:space="preserve">Benchmark</w:t>
+            </w:r>
+          </w:p>
+        </w:tc>
+        <w:tc>
+          <w:tcPr/>
+          <w:p>
+            <w:pPr>
+              <w:pStyle w:val="Compact"/>
+              <w:jc w:val="left"/>
+            </w:pPr>
+            <w:r>
               <w:t xml:space="preserve">❌ No</w:t>
             </w:r>
           </w:p>
@@ -4353,6 +5050,18 @@
               <w:jc w:val="left"/>
             </w:pPr>
             <w:r>
+              <w:t xml:space="preserve">Benchmark</w:t>
+            </w:r>
+          </w:p>
+        </w:tc>
+        <w:tc>
+          <w:tcPr/>
+          <w:p>
+            <w:pPr>
+              <w:pStyle w:val="Compact"/>
+              <w:jc w:val="left"/>
+            </w:pPr>
+            <w:r>
               <w:t xml:space="preserve">❌ No</w:t>
             </w:r>
           </w:p>
@@ -4402,8 +5111,8 @@
         </w:pict>
       </w:r>
     </w:p>
-    <w:bookmarkEnd w:id="54"/>
-    <w:bookmarkStart w:id="55" w:name="what-is-missing-the-gap-1"/>
+    <w:bookmarkEnd w:id="56"/>
+    <w:bookmarkStart w:id="57" w:name="Xa43c698aa5441234cc980e8d4b4054fad19fe04"/>
     <w:p>
       <w:pPr>
         <w:pStyle w:val="Heading3"/>
@@ -4425,7 +5134,7 @@
         <w:t xml:space="preserve"> </w:t>
       </w:r>
       <w:r>
-        <w:t xml:space="preserve">(The Gap)</w:t>
+        <w:t xml:space="preserve">(The Gap) — UPDATED with ZipperGen</w:t>
       </w:r>
     </w:p>
     <w:tbl>
@@ -4518,7 +5227,59 @@
               <w:jc w:val="left"/>
             </w:pPr>
             <w:r>
-              <w:t xml:space="preserve">ABC, ACP, Runtime Governance</w:t>
+              <w:t xml:space="preserve">ABC, ACP, Runtime Governance (single-agent)</w:t>
+            </w:r>
+          </w:p>
+        </w:tc>
+      </w:tr>
+      <w:tr>
+        <w:tc>
+          <w:tcPr/>
+          <w:p>
+            <w:pPr>
+              <w:pStyle w:val="Compact"/>
+              <w:jc w:val="left"/>
+            </w:pPr>
+            <w:r>
+              <w:rPr>
+                <w:bCs/>
+                <w:b/>
+              </w:rPr>
+              <w:t xml:space="preserve">Deterministic multi-agent coordination enforcement</w:t>
+            </w:r>
+          </w:p>
+        </w:tc>
+        <w:tc>
+          <w:tcPr/>
+          <w:p>
+            <w:pPr>
+              <w:pStyle w:val="Compact"/>
+              <w:jc w:val="left"/>
+            </w:pPr>
+            <w:r>
+              <w:t xml:space="preserve">✅ Yes</w:t>
+            </w:r>
+          </w:p>
+        </w:tc>
+        <w:tc>
+          <w:tcPr/>
+          <w:p>
+            <w:pPr>
+              <w:pStyle w:val="Compact"/>
+              <w:jc w:val="left"/>
+            </w:pPr>
+            <w:r>
+              <w:rPr>
+                <w:bCs/>
+                <w:b/>
+              </w:rPr>
+              <w:t xml:space="preserve">ZipperGen</w:t>
+            </w:r>
+            <w:r>
+              <w:t xml:space="preserve"> </w:t>
+            </w:r>
+            <w:r>
+              <w:t xml:space="preserve">— message structure guaranteed correct; action content remains opaque</w:t>
             </w:r>
           </w:p>
         </w:tc>
@@ -4602,7 +5363,7 @@
               <w:jc w:val="left"/>
             </w:pPr>
             <w:r>
-              <w:t xml:space="preserve">ACP (TLA+), SentinelAgent (TLA+)</w:t>
+              <w:t xml:space="preserve">ACP (TLA+), SentinelAgent (TLA+), ZipperGen (structural induction)</w:t>
             </w:r>
           </w:p>
         </w:tc>
@@ -4632,6 +5393,58 @@
               <w:jc w:val="left"/>
             </w:pPr>
             <w:r>
+              <w:t xml:space="preserve">✅ Yes</w:t>
+            </w:r>
+          </w:p>
+        </w:tc>
+        <w:tc>
+          <w:tcPr/>
+          <w:p>
+            <w:pPr>
+              <w:pStyle w:val="Compact"/>
+              <w:jc w:val="left"/>
+            </w:pPr>
+            <w:r>
+              <w:rPr>
+                <w:bCs/>
+                <w:b/>
+              </w:rPr>
+              <w:t xml:space="preserve">ZipperGen</w:t>
+            </w:r>
+            <w:r>
+              <w:t xml:space="preserve"> </w:t>
+            </w:r>
+            <w:r>
+              <w:t xml:space="preserve">— MSC-based DSL with syntax-directed projection</w:t>
+            </w:r>
+          </w:p>
+        </w:tc>
+      </w:tr>
+      <w:tr>
+        <w:tc>
+          <w:tcPr/>
+          <w:p>
+            <w:pPr>
+              <w:pStyle w:val="Compact"/>
+              <w:jc w:val="left"/>
+            </w:pPr>
+            <w:r>
+              <w:rPr>
+                <w:bCs/>
+                <w:b/>
+              </w:rPr>
+              <w:t xml:space="preserve">Behavioral typing of message content</w:t>
+            </w:r>
+          </w:p>
+        </w:tc>
+        <w:tc>
+          <w:tcPr/>
+          <w:p>
+            <w:pPr>
+              <w:pStyle w:val="Compact"/>
+              <w:jc w:val="left"/>
+            </w:pPr>
+            <w:r>
               <w:t xml:space="preserve">❌ No</w:t>
             </w:r>
           </w:p>
@@ -4644,7 +5457,7 @@
               <w:jc w:val="left"/>
             </w:pPr>
             <w:r>
-              <w:t xml:space="preserve">No multi-party session type checking at runtime</w:t>
+              <w:t xml:space="preserve">ZipperGen checks structure, not what LLMs put inside messages</w:t>
             </w:r>
           </w:p>
         </w:tc>
@@ -4686,7 +5499,7 @@
               <w:jc w:val="left"/>
             </w:pPr>
             <w:r>
-              <w:t xml:space="preserve">No runtime checking that composed skills preserve invariants</w:t>
+              <w:t xml:space="preserve">No static analysis of how multiple skills compose within a single agent</w:t>
             </w:r>
           </w:p>
         </w:tc>
@@ -4783,8 +5596,8 @@
         </w:pict>
       </w:r>
     </w:p>
-    <w:bookmarkEnd w:id="55"/>
-    <w:bookmarkStart w:id="56" w:name="verdict-on-question-3"/>
+    <w:bookmarkEnd w:id="57"/>
+    <w:bookmarkStart w:id="58" w:name="verdict-on-question-3"/>
     <w:p>
       <w:pPr>
         <w:pStyle w:val="Heading3"/>
@@ -4802,7 +5615,77 @@
           <w:bCs/>
           <w:b/>
         </w:rPr>
-        <w:t xml:space="preserve">Deterministic runtime enforcement exists and is production-ready (ACP, ABC/AgentAssert). These are not LLM-as-judge — they use formal risk scoring, temporal logic, and contract enforcement. The fastest (ACP) is sub-microsecond with TLA+ formal verification. However, MPST-style multi-party session type enforcement and automatic rollback are still research gaps.</w:t>
+        <w:t xml:space="preserve">Deterministic runtime enforcement exists at both single-agent (ACP, ABC/AgentAssert) and multi-agent (ZipperGen) levels. ZipperGen is the breakthrough: it guarantees deadlock-free coordination regardless of LLM nondeterminism, by separating deterministic message structure (enforced) from stochastic actions (opaque). The remaining gap is not</w:t>
+      </w:r>
+      <w:r>
+        <w:rPr>
+          <w:bCs/>
+          <w:b/>
+        </w:rPr>
+        <w:t xml:space="preserve"> </w:t>
+      </w:r>
+      <w:r>
+        <w:rPr>
+          <w:bCs/>
+          <w:b/>
+        </w:rPr>
+        <w:t xml:space="preserve">“</w:t>
+      </w:r>
+      <w:r>
+        <w:rPr>
+          <w:bCs/>
+          <w:b/>
+        </w:rPr>
+        <w:t xml:space="preserve">does MPST exist for agents?</w:t>
+      </w:r>
+      <w:r>
+        <w:rPr>
+          <w:bCs/>
+          <w:b/>
+        </w:rPr>
+        <w:t xml:space="preserve">”</w:t>
+      </w:r>
+      <w:r>
+        <w:rPr>
+          <w:bCs/>
+          <w:b/>
+        </w:rPr>
+        <w:t xml:space="preserve"> </w:t>
+      </w:r>
+      <w:r>
+        <w:rPr>
+          <w:bCs/>
+          <w:b/>
+        </w:rPr>
+        <w:t xml:space="preserve">— it does — but</w:t>
+      </w:r>
+      <w:r>
+        <w:rPr>
+          <w:bCs/>
+          <w:b/>
+        </w:rPr>
+        <w:t xml:space="preserve"> </w:t>
+      </w:r>
+      <w:r>
+        <w:rPr>
+          <w:bCs/>
+          <w:b/>
+        </w:rPr>
+        <w:t xml:space="preserve">“</w:t>
+      </w:r>
+      <w:r>
+        <w:rPr>
+          <w:bCs/>
+          <w:b/>
+        </w:rPr>
+        <w:t xml:space="preserve">can we type-check the content of LLM actions within that structure?</w:t>
+      </w:r>
+      <w:r>
+        <w:rPr>
+          <w:bCs/>
+          <w:b/>
+        </w:rPr>
+        <w:t xml:space="preserve">”</w:t>
       </w:r>
     </w:p>
     <w:p>
@@ -4812,9 +5695,9 @@
         </w:pict>
       </w:r>
     </w:p>
-    <w:bookmarkEnd w:id="56"/>
-    <w:bookmarkEnd w:id="57"/>
-    <w:bookmarkStart w:id="60" w:name="overall-assessment"/>
+    <w:bookmarkEnd w:id="58"/>
+    <w:bookmarkEnd w:id="59"/>
+    <w:bookmarkStart w:id="62" w:name="overall-assessment"/>
     <w:p>
       <w:pPr>
         <w:pStyle w:val="Heading2"/>
@@ -4823,7 +5706,7 @@
         <w:t xml:space="preserve">Overall Assessment</w:t>
       </w:r>
     </w:p>
-    <w:bookmarkStart w:id="58" w:name="the-three-questions-synthesis"/>
+    <w:bookmarkStart w:id="60" w:name="the-three-questions-synthesis"/>
     <w:p>
       <w:pPr>
         <w:pStyle w:val="Heading3"/>
@@ -4840,10 +5723,10 @@
         <w:jc w:val="start"/>
       </w:tblPr>
       <w:tblGrid>
-        <w:gridCol w:w="1885"/>
-        <w:gridCol w:w="1508"/>
-        <w:gridCol w:w="3582"/>
-        <w:gridCol w:w="942"/>
+        <w:gridCol w:w="1342"/>
+        <w:gridCol w:w="1073"/>
+        <w:gridCol w:w="2550"/>
+        <w:gridCol w:w="2953"/>
       </w:tblGrid>
       <w:tr>
         <w:trPr>
@@ -4893,7 +5776,7 @@
               <w:jc w:val="left"/>
             </w:pPr>
             <w:r>
-              <w:t xml:space="preserve">Gap</w:t>
+              <w:t xml:space="preserve">What ZipperGen Changes</w:t>
             </w:r>
           </w:p>
         </w:tc>
@@ -4947,7 +5830,7 @@
               <w:jc w:val="left"/>
             </w:pPr>
             <w:r>
-              <w:t xml:space="preserve">No formal guarantee without L3 enforcement</w:t>
+              <w:t xml:space="preserve">ZipperGen does not directly address this, but its runtime planning extension shows LLMs can generate coordination structures that are formally guaranteed</w:t>
             </w:r>
           </w:p>
         </w:tc>
@@ -4977,31 +5860,51 @@
               <w:jc w:val="left"/>
             </w:pPr>
             <w:r>
-              <w:t xml:space="preserve">⚠️ Partial</w:t>
-            </w:r>
-          </w:p>
-        </w:tc>
-        <w:tc>
-          <w:tcPr/>
-          <w:p>
-            <w:pPr>
-              <w:pStyle w:val="Compact"/>
-              <w:jc w:val="left"/>
-            </w:pPr>
-            <w:r>
-              <w:t xml:space="preserve">SkillFortify, SkCC, GovernSpec</w:t>
-            </w:r>
-          </w:p>
-        </w:tc>
-        <w:tc>
-          <w:tcPr/>
-          <w:p>
-            <w:pPr>
-              <w:pStyle w:val="Compact"/>
-              <w:jc w:val="left"/>
-            </w:pPr>
-            <w:r>
-              <w:t xml:space="preserve">No formal type system for NL skills; no MPST static checking</w:t>
+              <w:t xml:space="preserve">✅ Yes for multi-agent</w:t>
+            </w:r>
+          </w:p>
+        </w:tc>
+        <w:tc>
+          <w:tcPr/>
+          <w:p>
+            <w:pPr>
+              <w:pStyle w:val="Compact"/>
+              <w:jc w:val="left"/>
+            </w:pPr>
+            <w:r>
+              <w:rPr>
+                <w:bCs/>
+                <w:b/>
+              </w:rPr>
+              <w:t xml:space="preserve">ZipperGen</w:t>
+            </w:r>
+            <w:r>
+              <w:t xml:space="preserve"> </w:t>
+            </w:r>
+            <w:r>
+              <w:t xml:space="preserve">— formal well-typedness checks, deadlock-free by construction</w:t>
+            </w:r>
+          </w:p>
+        </w:tc>
+        <w:tc>
+          <w:tcPr/>
+          <w:p>
+            <w:pPr>
+              <w:pStyle w:val="Compact"/>
+              <w:jc w:val="left"/>
+            </w:pPr>
+            <w:r>
+              <w:rPr>
+                <w:bCs/>
+                <w:b/>
+              </w:rPr>
+              <w:t xml:space="preserve">Closes the MPST gap:</w:t>
+            </w:r>
+            <w:r>
+              <w:t xml:space="preserve"> </w:t>
+            </w:r>
+            <w:r>
+              <w:t xml:space="preserve">formal global specs + deterministic local projection</w:t>
             </w:r>
           </w:p>
         </w:tc>
@@ -5031,44 +5934,64 @@
               <w:jc w:val="left"/>
             </w:pPr>
             <w:r>
-              <w:t xml:space="preserve">✅ Yes</w:t>
-            </w:r>
-          </w:p>
-        </w:tc>
-        <w:tc>
-          <w:tcPr/>
-          <w:p>
-            <w:pPr>
-              <w:pStyle w:val="Compact"/>
-              <w:jc w:val="left"/>
-            </w:pPr>
-            <w:r>
-              <w:t xml:space="preserve">ACP, ABC/AgentAssert, Runtime Governance</w:t>
-            </w:r>
-          </w:p>
-        </w:tc>
-        <w:tc>
-          <w:tcPr/>
-          <w:p>
-            <w:pPr>
-              <w:pStyle w:val="Compact"/>
-              <w:jc w:val="left"/>
-            </w:pPr>
-            <w:r>
-              <w:t xml:space="preserve">No MPST runtime enforcement; no automatic rollback</w:t>
+              <w:t xml:space="preserve">✅ Yes for multi-agent</w:t>
+            </w:r>
+          </w:p>
+        </w:tc>
+        <w:tc>
+          <w:tcPr/>
+          <w:p>
+            <w:pPr>
+              <w:pStyle w:val="Compact"/>
+              <w:jc w:val="left"/>
+            </w:pPr>
+            <w:r>
+              <w:rPr>
+                <w:bCs/>
+                <w:b/>
+              </w:rPr>
+              <w:t xml:space="preserve">ZipperGen</w:t>
+            </w:r>
+            <w:r>
+              <w:t xml:space="preserve"> </w:t>
+            </w:r>
+            <w:r>
+              <w:t xml:space="preserve">— coordination structure enforced deterministically, independent of LLM nondeterminism</w:t>
+            </w:r>
+          </w:p>
+        </w:tc>
+        <w:tc>
+          <w:tcPr/>
+          <w:p>
+            <w:pPr>
+              <w:pStyle w:val="Compact"/>
+              <w:jc w:val="left"/>
+            </w:pPr>
+            <w:r>
+              <w:rPr>
+                <w:bCs/>
+                <w:b/>
+              </w:rPr>
+              <w:t xml:space="preserve">Closes the multi-agent gap:</w:t>
+            </w:r>
+            <w:r>
+              <w:t xml:space="preserve"> </w:t>
+            </w:r>
+            <w:r>
+              <w:t xml:space="preserve">the only paper that guarantees correct multi-agent coordination regardless of LLM stochasticity</w:t>
             </w:r>
           </w:p>
         </w:tc>
       </w:tr>
     </w:tbl>
-    <w:bookmarkEnd w:id="58"/>
-    <w:bookmarkStart w:id="59" w:name="the-mpst-opportunity"/>
+    <w:bookmarkEnd w:id="60"/>
+    <w:bookmarkStart w:id="61" w:name="the-mpst-opportunity-revised"/>
     <w:p>
       <w:pPr>
         <w:pStyle w:val="Heading3"/>
       </w:pPr>
       <w:r>
-        <w:t xml:space="preserve">The MPST Opportunity</w:t>
+        <w:t xml:space="preserve">The MPST Opportunity — REVISED</w:t>
       </w:r>
     </w:p>
     <w:p>
@@ -5076,17 +5999,17 @@
         <w:pStyle w:val="FirstParagraph"/>
       </w:pPr>
       <w:r>
-        <w:t xml:space="preserve">Your intuition is correct:</w:t>
-      </w:r>
-      <w:r>
-        <w:t xml:space="preserve"> </w:t>
-      </w:r>
-      <w:r>
-        <w:rPr>
-          <w:bCs/>
-          <w:b/>
-        </w:rPr>
-        <w:t xml:space="preserve">the gap is at the intersection of all three.</w:t>
+        <w:rPr>
+          <w:bCs/>
+          <w:b/>
+        </w:rPr>
+        <w:t xml:space="preserve">The MPST gap is now partially closed by ZipperGen.</w:t>
+      </w:r>
+      <w:r>
+        <w:t xml:space="preserve"> </w:t>
+      </w:r>
+      <w:r>
+        <w:t xml:space="preserve">Here is what exists and what remains:</w:t>
       </w:r>
     </w:p>
     <w:p>
@@ -5094,73 +6017,143 @@
         <w:pStyle w:val="BodyText"/>
       </w:pPr>
       <w:r>
-        <w:t xml:space="preserve">What doesn’t exist yet:</w:t>
-      </w:r>
-      <w:r>
-        <w:t xml:space="preserve"> </w:t>
-      </w:r>
-      <w:r>
-        <w:t xml:space="preserve">-</w:t>
-      </w:r>
-      <w:r>
-        <w:t xml:space="preserve"> </w:t>
-      </w:r>
-      <w:r>
-        <w:rPr>
-          <w:bCs/>
-          <w:b/>
-        </w:rPr>
-        <w:t xml:space="preserve">Static:</w:t>
-      </w:r>
-      <w:r>
-        <w:t xml:space="preserve"> </w:t>
-      </w:r>
-      <w:r>
-        <w:t xml:space="preserve">MPST session types for multi-agent skill interactions, checked before runtime</w:t>
-      </w:r>
-      <w:r>
-        <w:t xml:space="preserve"> </w:t>
-      </w:r>
-      <w:r>
-        <w:t xml:space="preserve">-</w:t>
-      </w:r>
-      <w:r>
-        <w:t xml:space="preserve"> </w:t>
-      </w:r>
-      <w:r>
-        <w:rPr>
-          <w:bCs/>
-          <w:b/>
-        </w:rPr>
-        <w:t xml:space="preserve">Runtime:</w:t>
-      </w:r>
-      <w:r>
-        <w:t xml:space="preserve"> </w:t>
-      </w:r>
-      <w:r>
-        <w:t xml:space="preserve">Deterministic enforcement of MPST protocols with blame assignment and rollback</w:t>
-      </w:r>
-      <w:r>
-        <w:t xml:space="preserve"> </w:t>
-      </w:r>
-      <w:r>
-        <w:t xml:space="preserve">-</w:t>
-      </w:r>
-      <w:r>
-        <w:t xml:space="preserve"> </w:t>
-      </w:r>
-      <w:r>
-        <w:rPr>
-          <w:bCs/>
-          <w:b/>
-        </w:rPr>
-        <w:t xml:space="preserve">Behavioral guarantee:</w:t>
-      </w:r>
-      <w:r>
-        <w:t xml:space="preserve"> </w:t>
-      </w:r>
-      <w:r>
-        <w:t xml:space="preserve">Proof that if all agents follow the protocol, global invariants hold</w:t>
+        <w:rPr>
+          <w:bCs/>
+          <w:b/>
+        </w:rPr>
+        <w:t xml:space="preserve">What ZipperGen provides (2026):</w:t>
+      </w:r>
+      <w:r>
+        <w:t xml:space="preserve"> </w:t>
+      </w:r>
+      <w:r>
+        <w:t xml:space="preserve">- ✅</w:t>
+      </w:r>
+      <w:r>
+        <w:t xml:space="preserve"> </w:t>
+      </w:r>
+      <w:r>
+        <w:rPr>
+          <w:bCs/>
+          <w:b/>
+        </w:rPr>
+        <w:t xml:space="preserve">Formal global specifications</w:t>
+      </w:r>
+      <w:r>
+        <w:t xml:space="preserve"> </w:t>
+      </w:r>
+      <w:r>
+        <w:t xml:space="preserve">for multi-agent coordination (MSC-based DSL)</w:t>
+      </w:r>
+      <w:r>
+        <w:t xml:space="preserve"> </w:t>
+      </w:r>
+      <w:r>
+        <w:t xml:space="preserve">- ✅</w:t>
+      </w:r>
+      <w:r>
+        <w:t xml:space="preserve"> </w:t>
+      </w:r>
+      <w:r>
+        <w:rPr>
+          <w:bCs/>
+          <w:b/>
+        </w:rPr>
+        <w:t xml:space="preserve">Static well-typedness checking</w:t>
+      </w:r>
+      <w:r>
+        <w:t xml:space="preserve"> </w:t>
+      </w:r>
+      <w:r>
+        <w:t xml:space="preserve">before runtime (payload matching, type correctness, control condition consistency)</w:t>
+      </w:r>
+      <w:r>
+        <w:t xml:space="preserve"> </w:t>
+      </w:r>
+      <w:r>
+        <w:t xml:space="preserve">- ✅</w:t>
+      </w:r>
+      <w:r>
+        <w:t xml:space="preserve"> </w:t>
+      </w:r>
+      <w:r>
+        <w:rPr>
+          <w:bCs/>
+          <w:b/>
+        </w:rPr>
+        <w:t xml:space="preserve">Deadlock-free by construction</w:t>
+      </w:r>
+      <w:r>
+        <w:t xml:space="preserve"> </w:t>
+      </w:r>
+      <w:r>
+        <w:t xml:space="preserve">— guaranteed via syntax-directed projection, not runtime detection</w:t>
+      </w:r>
+      <w:r>
+        <w:t xml:space="preserve"> </w:t>
+      </w:r>
+      <w:r>
+        <w:t xml:space="preserve">- ✅</w:t>
+      </w:r>
+      <w:r>
+        <w:t xml:space="preserve"> </w:t>
+      </w:r>
+      <w:r>
+        <w:rPr>
+          <w:bCs/>
+          <w:b/>
+        </w:rPr>
+        <w:t xml:space="preserve">Runtime execution</w:t>
+      </w:r>
+      <w:r>
+        <w:t xml:space="preserve"> </w:t>
+      </w:r>
+      <w:r>
+        <w:t xml:space="preserve">of projected local programs — deterministic finite-state programs, no LLM-as-judge for coordination</w:t>
+      </w:r>
+      <w:r>
+        <w:t xml:space="preserve"> </w:t>
+      </w:r>
+      <w:r>
+        <w:t xml:space="preserve">- ✅</w:t>
+      </w:r>
+      <w:r>
+        <w:t xml:space="preserve"> </w:t>
+      </w:r>
+      <w:r>
+        <w:rPr>
+          <w:bCs/>
+          <w:b/>
+        </w:rPr>
+        <w:t xml:space="preserve">LLM runtime planning</w:t>
+      </w:r>
+      <w:r>
+        <w:t xml:space="preserve"> </w:t>
+      </w:r>
+      <w:r>
+        <w:t xml:space="preserve">— an LLM can dynamically generate coordination workflows and the same guarantees apply</w:t>
+      </w:r>
+      <w:r>
+        <w:t xml:space="preserve"> </w:t>
+      </w:r>
+      <w:r>
+        <w:t xml:space="preserve">- ✅</w:t>
+      </w:r>
+      <w:r>
+        <w:t xml:space="preserve"> </w:t>
+      </w:r>
+      <w:r>
+        <w:rPr>
+          <w:bCs/>
+          <w:b/>
+        </w:rPr>
+        <w:t xml:space="preserve">Open-source implementation</w:t>
+      </w:r>
+      <w:r>
+        <w:t xml:space="preserve"> </w:t>
+      </w:r>
+      <w:r>
+        <w:t xml:space="preserve">— https://zippergen.io</w:t>
       </w:r>
     </w:p>
     <w:p>
@@ -5168,95 +6161,152 @@
         <w:pStyle w:val="BodyText"/>
       </w:pPr>
       <w:r>
-        <w:t xml:space="preserve">The closest existing work:</w:t>
-      </w:r>
-      <w:r>
-        <w:t xml:space="preserve"> </w:t>
-      </w:r>
-      <w:r>
-        <w:t xml:space="preserve">-</w:t>
-      </w:r>
-      <w:r>
-        <w:t xml:space="preserve"> </w:t>
-      </w:r>
-      <w:r>
-        <w:rPr>
-          <w:bCs/>
-          <w:b/>
-        </w:rPr>
-        <w:t xml:space="preserve">ACP</w:t>
-      </w:r>
-      <w:r>
-        <w:t xml:space="preserve"> </w:t>
-      </w:r>
-      <w:r>
-        <w:t xml:space="preserve">— fast, formally verified, temporal admission control (single agent)</w:t>
-      </w:r>
-      <w:r>
-        <w:t xml:space="preserve"> </w:t>
-      </w:r>
-      <w:r>
-        <w:t xml:space="preserve">-</w:t>
-      </w:r>
-      <w:r>
-        <w:t xml:space="preserve"> </w:t>
-      </w:r>
-      <w:r>
-        <w:rPr>
-          <w:bCs/>
-          <w:b/>
-        </w:rPr>
-        <w:t xml:space="preserve">ABC</w:t>
-      </w:r>
-      <w:r>
-        <w:t xml:space="preserve"> </w:t>
-      </w:r>
-      <w:r>
-        <w:t xml:space="preserve">— behavioral contracts with probabilistic compliance (single agent)</w:t>
-      </w:r>
-      <w:r>
-        <w:t xml:space="preserve"> </w:t>
-      </w:r>
-      <w:r>
-        <w:t xml:space="preserve">-</w:t>
-      </w:r>
-      <w:r>
-        <w:t xml:space="preserve"> </w:t>
-      </w:r>
-      <w:r>
-        <w:rPr>
-          <w:bCs/>
-          <w:b/>
-        </w:rPr>
-        <w:t xml:space="preserve">SentinelAgent</w:t>
-      </w:r>
-      <w:r>
-        <w:t xml:space="preserve"> </w:t>
-      </w:r>
-      <w:r>
-        <w:t xml:space="preserve">— formal delegation chain verification (multi-agent, but not general protocols)</w:t>
-      </w:r>
-      <w:r>
-        <w:t xml:space="preserve"> </w:t>
-      </w:r>
-      <w:r>
-        <w:t xml:space="preserve">-</w:t>
-      </w:r>
-      <w:r>
-        <w:t xml:space="preserve"> </w:t>
-      </w:r>
-      <w:r>
-        <w:rPr>
-          <w:bCs/>
-          <w:b/>
-        </w:rPr>
-        <w:t xml:space="preserve">Runtime Governance</w:t>
-      </w:r>
-      <w:r>
-        <w:t xml:space="preserve"> </w:t>
-      </w:r>
-      <w:r>
-        <w:t xml:space="preserve">— temporal predicates on paths (expressive, but not yet multi-agent)</w:t>
+        <w:rPr>
+          <w:bCs/>
+          <w:b/>
+        </w:rPr>
+        <w:t xml:space="preserve">What remains missing (the new frontier):</w:t>
+      </w:r>
+      <w:r>
+        <w:t xml:space="preserve"> </w:t>
+      </w:r>
+      <w:r>
+        <w:t xml:space="preserve">- ❌</w:t>
+      </w:r>
+      <w:r>
+        <w:t xml:space="preserve"> </w:t>
+      </w:r>
+      <w:r>
+        <w:rPr>
+          <w:bCs/>
+          <w:b/>
+        </w:rPr>
+        <w:t xml:space="preserve">Behavioral typing of LLM actions</w:t>
+      </w:r>
+      <w:r>
+        <w:t xml:space="preserve"> </w:t>
+      </w:r>
+      <w:r>
+        <w:t xml:space="preserve">— ZipperGen treats LLM actions as opaque blocks; it does not verify</w:t>
+      </w:r>
+      <w:r>
+        <w:t xml:space="preserve"> </w:t>
+      </w:r>
+      <w:r>
+        <w:rPr>
+          <w:iCs/>
+          <w:i/>
+        </w:rPr>
+        <w:t xml:space="preserve">what</w:t>
+      </w:r>
+      <w:r>
+        <w:t xml:space="preserve"> </w:t>
+      </w:r>
+      <w:r>
+        <w:t xml:space="preserve">the LLM computes inside them</w:t>
+      </w:r>
+      <w:r>
+        <w:t xml:space="preserve"> </w:t>
+      </w:r>
+      <w:r>
+        <w:t xml:space="preserve">- ❌</w:t>
+      </w:r>
+      <w:r>
+        <w:t xml:space="preserve"> </w:t>
+      </w:r>
+      <w:r>
+        <w:rPr>
+          <w:bCs/>
+          <w:b/>
+        </w:rPr>
+        <w:t xml:space="preserve">Skill-skill composition within a single agent</w:t>
+      </w:r>
+      <w:r>
+        <w:t xml:space="preserve"> </w:t>
+      </w:r>
+      <w:r>
+        <w:t xml:space="preserve">— ZipperGen verifies multi-agent coordination, not how skills compose within one agent</w:t>
+      </w:r>
+      <w:r>
+        <w:t xml:space="preserve"> </w:t>
+      </w:r>
+      <w:r>
+        <w:t xml:space="preserve">- ❌</w:t>
+      </w:r>
+      <w:r>
+        <w:t xml:space="preserve"> </w:t>
+      </w:r>
+      <w:r>
+        <w:rPr>
+          <w:bCs/>
+          <w:b/>
+        </w:rPr>
+        <w:t xml:space="preserve">Blame assignment</w:t>
+      </w:r>
+      <w:r>
+        <w:t xml:space="preserve"> </w:t>
+      </w:r>
+      <w:r>
+        <w:t xml:space="preserve">— When coordination fails, ZipperGen does not identify which agent (or which LLM action) is at fault</w:t>
+      </w:r>
+      <w:r>
+        <w:t xml:space="preserve"> </w:t>
+      </w:r>
+      <w:r>
+        <w:t xml:space="preserve">- ❌</w:t>
+      </w:r>
+      <w:r>
+        <w:t xml:space="preserve"> </w:t>
+      </w:r>
+      <w:r>
+        <w:rPr>
+          <w:bCs/>
+          <w:b/>
+        </w:rPr>
+        <w:t xml:space="preserve">Runtime behavioral enforcement</w:t>
+      </w:r>
+      <w:r>
+        <w:t xml:space="preserve"> </w:t>
+      </w:r>
+      <w:r>
+        <w:t xml:space="preserve">— ZipperGen enforces message structure, not behavior (e.g.,</w:t>
+      </w:r>
+      <w:r>
+        <w:t xml:space="preserve"> </w:t>
+      </w:r>
+      <w:r>
+        <w:t xml:space="preserve">“</w:t>
+      </w:r>
+      <w:r>
+        <w:t xml:space="preserve">this agent must not send credit card numbers</w:t>
+      </w:r>
+      <w:r>
+        <w:t xml:space="preserve">”</w:t>
+      </w:r>
+      <w:r>
+        <w:t xml:space="preserve">)</w:t>
+      </w:r>
+      <w:r>
+        <w:t xml:space="preserve"> </w:t>
+      </w:r>
+      <w:r>
+        <w:t xml:space="preserve">- ❌</w:t>
+      </w:r>
+      <w:r>
+        <w:t xml:space="preserve"> </w:t>
+      </w:r>
+      <w:r>
+        <w:rPr>
+          <w:bCs/>
+          <w:b/>
+        </w:rPr>
+        <w:t xml:space="preserve">Automatic rollback</w:t>
+      </w:r>
+      <w:r>
+        <w:t xml:space="preserve"> </w:t>
+      </w:r>
+      <w:r>
+        <w:t xml:space="preserve">— No mechanism to revert multi-agent execution when a violation is detected</w:t>
       </w:r>
     </w:p>
     <w:p>
@@ -5268,13 +6318,284 @@
           <w:bCs/>
           <w:b/>
         </w:rPr>
-        <w:t xml:space="preserve">The research opportunity:</w:t>
-      </w:r>
-      <w:r>
-        <w:t xml:space="preserve"> </w:t>
-      </w:r>
-      <w:r>
-        <w:t xml:space="preserve">Extend MPST to the agent skill domain — static session type checking for skill composition, plus deterministic runtime enforcement with sub-microsecond overhead and formal verification.</w:t>
+        <w:t xml:space="preserve">The research opportunity is now sharper:</w:t>
+      </w:r>
+    </w:p>
+    <w:p>
+      <w:pPr>
+        <w:pStyle w:val="BodyText"/>
+      </w:pPr>
+      <w:r>
+        <w:t xml:space="preserve">Before ZipperGen:</w:t>
+      </w:r>
+      <w:r>
+        <w:t xml:space="preserve"> </w:t>
+      </w:r>
+      <w:r>
+        <w:t xml:space="preserve">“</w:t>
+      </w:r>
+      <w:r>
+        <w:t xml:space="preserve">Does MPST for LLM agents exist?</w:t>
+      </w:r>
+      <w:r>
+        <w:t xml:space="preserve">”</w:t>
+      </w:r>
+      <w:r>
+        <w:t xml:space="preserve"> </w:t>
+      </w:r>
+      <w:r>
+        <w:t xml:space="preserve">→ No.</w:t>
+      </w:r>
+      <w:r>
+        <w:t xml:space="preserve"> </w:t>
+      </w:r>
+      <w:r>
+        <w:t xml:space="preserve">After ZipperGen:</w:t>
+      </w:r>
+      <w:r>
+        <w:t xml:space="preserve"> </w:t>
+      </w:r>
+      <w:r>
+        <w:t xml:space="preserve">“</w:t>
+      </w:r>
+      <w:r>
+        <w:t xml:space="preserve">How do we add behavioral typing, blame, and rollback to the ZipperGen framework?</w:t>
+      </w:r>
+      <w:r>
+        <w:t xml:space="preserve">”</w:t>
+      </w:r>
+    </w:p>
+    <w:p>
+      <w:pPr>
+        <w:pStyle w:val="BodyText"/>
+      </w:pPr>
+      <w:r>
+        <w:t xml:space="preserve">Specifically:</w:t>
+      </w:r>
+      <w:r>
+        <w:t xml:space="preserve"> </w:t>
+      </w:r>
+      <w:r>
+        <w:t xml:space="preserve">1.</w:t>
+      </w:r>
+      <w:r>
+        <w:t xml:space="preserve"> </w:t>
+      </w:r>
+      <w:r>
+        <w:rPr>
+          <w:bCs/>
+          <w:b/>
+        </w:rPr>
+        <w:t xml:space="preserve">Action-level contracts:</w:t>
+      </w:r>
+      <w:r>
+        <w:t xml:space="preserve"> </w:t>
+      </w:r>
+      <w:r>
+        <w:t xml:space="preserve">Extend ZipperGen’s action blocks from opaque</w:t>
+      </w:r>
+      <w:r>
+        <w:t xml:space="preserve"> </w:t>
+      </w:r>
+      <w:r>
+        <w:rPr>
+          <w:rStyle w:val="VerbatimChar"/>
+        </w:rPr>
+        <w:t xml:space="preserve">act A: y = f(x)</w:t>
+      </w:r>
+      <w:r>
+        <w:t xml:space="preserve"> </w:t>
+      </w:r>
+      <w:r>
+        <w:t xml:space="preserve">to contract-typed</w:t>
+      </w:r>
+      <w:r>
+        <w:t xml:space="preserve"> </w:t>
+      </w:r>
+      <w:r>
+        <w:rPr>
+          <w:rStyle w:val="VerbatimChar"/>
+        </w:rPr>
+        <w:t xml:space="preserve">act A: y = f(x) requires P ensures Q</w:t>
+      </w:r>
+      <w:r>
+        <w:t xml:space="preserve"> </w:t>
+      </w:r>
+      <w:r>
+        <w:t xml:space="preserve">— where P/Q are pre/postconditions enforced by ABC/AgentAssert or ACP</w:t>
+      </w:r>
+      <w:r>
+        <w:t xml:space="preserve"> </w:t>
+      </w:r>
+      <w:r>
+        <w:t xml:space="preserve">2.</w:t>
+      </w:r>
+      <w:r>
+        <w:t xml:space="preserve"> </w:t>
+      </w:r>
+      <w:r>
+        <w:rPr>
+          <w:bCs/>
+          <w:b/>
+        </w:rPr>
+        <w:t xml:space="preserve">Skill composition:</w:t>
+      </w:r>
+      <w:r>
+        <w:t xml:space="preserve"> </w:t>
+      </w:r>
+      <w:r>
+        <w:t xml:space="preserve">Apply ZipperGen’s projection logic to intra-agent skill composition (e.g., when two skills loaded by the same agent interact via tool calls)</w:t>
+      </w:r>
+      <w:r>
+        <w:t xml:space="preserve"> </w:t>
+      </w:r>
+      <w:r>
+        <w:t xml:space="preserve">3.</w:t>
+      </w:r>
+      <w:r>
+        <w:t xml:space="preserve"> </w:t>
+      </w:r>
+      <w:r>
+        <w:rPr>
+          <w:bCs/>
+          <w:b/>
+        </w:rPr>
+        <w:t xml:space="preserve">Blame and rollback:</w:t>
+      </w:r>
+      <w:r>
+        <w:t xml:space="preserve"> </w:t>
+      </w:r>
+      <w:r>
+        <w:t xml:space="preserve">Add sentinel actions that monitor message payloads and trigger rollback protocols when violations are detected</w:t>
+      </w:r>
+    </w:p>
+    <w:p>
+      <w:pPr>
+        <w:pStyle w:val="BodyText"/>
+      </w:pPr>
+      <w:r>
+        <w:rPr>
+          <w:bCs/>
+          <w:b/>
+        </w:rPr>
+        <w:t xml:space="preserve">The architecture of the future:</w:t>
+      </w:r>
+    </w:p>
+    <w:p>
+      <w:pPr>
+        <w:pStyle w:val="SourceCode"/>
+      </w:pPr>
+      <w:r>
+        <w:rPr>
+          <w:rStyle w:val="VerbatimChar"/>
+        </w:rPr>
+        <w:t xml:space="preserve">Global Specification (ZipperGen MSC)</w:t>
+      </w:r>
+      <w:r>
+        <w:br/>
+      </w:r>
+      <w:r>
+        <w:rPr>
+          <w:rStyle w:val="VerbatimChar"/>
+        </w:rPr>
+        <w:t xml:space="preserve">    ↓ Syntax-directed projection</w:t>
+      </w:r>
+      <w:r>
+        <w:br/>
+      </w:r>
+      <w:r>
+        <w:rPr>
+          <w:rStyle w:val="VerbatimChar"/>
+        </w:rPr>
+        <w:t xml:space="preserve">Local Agent Programs (deadlock-free by construction)</w:t>
+      </w:r>
+      <w:r>
+        <w:br/>
+      </w:r>
+      <w:r>
+        <w:rPr>
+          <w:rStyle w:val="VerbatimChar"/>
+        </w:rPr>
+        <w:t xml:space="preserve">    ↓ Runtime execution</w:t>
+      </w:r>
+      <w:r>
+        <w:br/>
+      </w:r>
+      <w:r>
+        <w:rPr>
+          <w:rStyle w:val="VerbatimChar"/>
+        </w:rPr>
+        <w:t xml:space="preserve">    ├─ Message passing (deterministic, guaranteed)</w:t>
+      </w:r>
+      <w:r>
+        <w:br/>
+      </w:r>
+      <w:r>
+        <w:rPr>
+          <w:rStyle w:val="VerbatimChar"/>
+        </w:rPr>
+        <w:t xml:space="preserve">    └─ Action blocks (opaque LLM calls)</w:t>
+      </w:r>
+      <w:r>
+        <w:br/>
+      </w:r>
+      <w:r>
+        <w:rPr>
+          <w:rStyle w:val="VerbatimChar"/>
+        </w:rPr>
+        <w:t xml:space="preserve">         ↓ ABC/ACP enforcement inside each action</w:t>
+      </w:r>
+      <w:r>
+        <w:br/>
+      </w:r>
+      <w:r>
+        <w:rPr>
+          <w:rStyle w:val="VerbatimChar"/>
+        </w:rPr>
+        <w:t xml:space="preserve">         Behavior contracts (pre/postconditions)</w:t>
+      </w:r>
+      <w:r>
+        <w:br/>
+      </w:r>
+      <w:r>
+        <w:rPr>
+          <w:rStyle w:val="VerbatimChar"/>
+        </w:rPr>
+        <w:t xml:space="preserve">         Admission control (risk scoring)</w:t>
+      </w:r>
+    </w:p>
+    <w:p>
+      <w:pPr>
+        <w:pStyle w:val="FirstParagraph"/>
+      </w:pPr>
+      <w:r>
+        <w:t xml:space="preserve">ZipperGen is the</w:t>
+      </w:r>
+      <w:r>
+        <w:t xml:space="preserve"> </w:t>
+      </w:r>
+      <w:r>
+        <w:rPr>
+          <w:bCs/>
+          <w:b/>
+        </w:rPr>
+        <w:t xml:space="preserve">coordination layer</w:t>
+      </w:r>
+      <w:r>
+        <w:t xml:space="preserve">. ABC/ACP is the</w:t>
+      </w:r>
+      <w:r>
+        <w:t xml:space="preserve"> </w:t>
+      </w:r>
+      <w:r>
+        <w:rPr>
+          <w:bCs/>
+          <w:b/>
+        </w:rPr>
+        <w:t xml:space="preserve">behavioral layer</w:t>
+      </w:r>
+      <w:r>
+        <w:t xml:space="preserve">. Together they form the complete multi-agent governance stack.</w:t>
       </w:r>
     </w:p>
     <w:p>
@@ -5293,12 +6614,12 @@
           <w:iCs/>
           <w:i/>
         </w:rPr>
-        <w:t xml:space="preserve">Compiled by EvaPaper | Based on 28 papers across the Three-Layer Governance Stack</w:t>
-      </w:r>
-    </w:p>
-    <w:bookmarkEnd w:id="59"/>
-    <w:bookmarkEnd w:id="60"/>
+        <w:t xml:space="preserve">Compiled by EvaPaper | Based on 29 papers across the Three-Layer Governance Stack</w:t>
+      </w:r>
+    </w:p>
     <w:bookmarkEnd w:id="61"/>
+    <w:bookmarkEnd w:id="62"/>
+    <w:bookmarkEnd w:id="63"/>
     <w:sectPr/>
   </w:body>
 </w:document>
@@ -5548,6 +6869,12 @@
     <w:abstractNumId w:val="991"/>
   </w:num>
   <w:num w:numId="1022">
+    <w:abstractNumId w:val="991"/>
+  </w:num>
+  <w:num w:numId="1023">
+    <w:abstractNumId w:val="991"/>
+  </w:num>
+  <w:num w:numId="1024">
     <w:abstractNumId w:val="991"/>
   </w:num>
 </w:numbering>

</xml_diff>

<commit_message>
Complete rewrite of Three Questions Synthesis with comprehensive overall assessment table, layer mapping, and conclusion
</commit_message>
<xml_diff>
--- a/Agent_Governance_Three_Questions_Synthesis.docx
+++ b/Agent_Governance_Three_Questions_Synthesis.docx
@@ -2,7 +2,7 @@
 <file path=word/document.xml><?xml version="1.0" encoding="utf-8"?>
 <w:document xmlns:w="http://schemas.openxmlformats.org/wordprocessingml/2006/main" xmlns:m="http://schemas.openxmlformats.org/officeDocument/2006/math" xmlns:r="http://schemas.openxmlformats.org/officeDocument/2006/relationships" xmlns:o="urn:schemas-microsoft-com:office:office" xmlns:v="urn:schemas-microsoft-com:vml" xmlns:w10="urn:schemas-microsoft-com:office:word" xmlns:a="http://schemas.openxmlformats.org/drawingml/2006/main" xmlns:pic="http://schemas.openxmlformats.org/drawingml/2006/picture" xmlns:wp="http://schemas.openxmlformats.org/drawingml/2006/wordprocessingDrawing">
   <w:body>
-    <w:bookmarkStart w:id="63" w:name="X0992f1a2b2abf70de3651cc59924546688bff95"/>
+    <w:bookmarkStart w:id="67" w:name="X0992f1a2b2abf70de3651cc59924546688bff95"/>
     <w:p>
       <w:pPr>
         <w:pStyle w:val="Heading1"/>
@@ -22,7 +22,7 @@
         <w:t xml:space="preserve"> </w:t>
       </w:r>
       <w:r>
-        <w:t xml:space="preserve">Based on 28 papers across the Three-Layer Governance Stack</w:t>
+        <w:t xml:space="preserve">Based on 29 papers across the Three-Layer Governance Stack</w:t>
       </w:r>
     </w:p>
     <w:p>
@@ -2712,7 +2712,7 @@
     </w:p>
     <w:bookmarkEnd w:id="41"/>
     <w:bookmarkEnd w:id="42"/>
-    <w:bookmarkStart w:id="59" w:name="X7180d2c2a2f74419f8b5d92768d779c842d335b"/>
+    <w:bookmarkStart w:id="58" w:name="X7180d2c2a2f74419f8b5d92768d779c842d335b"/>
     <w:p>
       <w:pPr>
         <w:pStyle w:val="Heading2"/>
@@ -2748,7 +2748,7 @@
       </w:r>
     </w:p>
     <w:bookmarkEnd w:id="43"/>
-    <w:bookmarkStart w:id="55" w:name="X35d57ced75411806b2ff142f3613f747d9dadf1"/>
+    <w:bookmarkStart w:id="54" w:name="X35d57ced75411806b2ff142f3613f747d9dadf1"/>
     <w:p>
       <w:pPr>
         <w:pStyle w:val="Heading3"/>
@@ -4152,151 +4152,8 @@
       </w:r>
     </w:p>
     <w:bookmarkEnd w:id="53"/>
-    <w:bookmarkStart w:id="54" w:name="X80474372f33bebeca79d59424e11d06222a4f95"/>
-    <w:p>
-      <w:pPr>
-        <w:pStyle w:val="Heading4"/>
-      </w:pPr>
-      <w:r>
-        <w:t xml:space="preserve">10.</w:t>
-      </w:r>
-      <w:r>
-        <w:t xml:space="preserve"> </w:t>
-      </w:r>
-      <w:r>
-        <w:rPr>
-          <w:bCs/>
-          <w:b/>
-        </w:rPr>
-        <w:t xml:space="preserve">ZipperGen / Provable Coordination for LLM Agents via MSCs</w:t>
-      </w:r>
-      <w:r>
-        <w:t xml:space="preserve"> </w:t>
-      </w:r>
-      <w:r>
-        <w:t xml:space="preserve">(arXiv:2604.17612, Cross-layer Layer 0+1)</w:t>
-      </w:r>
-    </w:p>
-    <w:p>
-      <w:pPr>
-        <w:numPr>
-          <w:ilvl w:val="0"/>
-          <w:numId w:val="1024"/>
-        </w:numPr>
-        <w:pStyle w:val="Compact"/>
-      </w:pPr>
-      <w:r>
-        <w:rPr>
-          <w:bCs/>
-          <w:b/>
-        </w:rPr>
-        <w:t xml:space="preserve">Deterministic:</w:t>
-      </w:r>
-      <w:r>
-        <w:t xml:space="preserve"> </w:t>
-      </w:r>
-      <w:r>
-        <w:t xml:space="preserve">Yes — message-passing structure is formally specified; LLM actions remain opaque</w:t>
-      </w:r>
-    </w:p>
-    <w:p>
-      <w:pPr>
-        <w:numPr>
-          <w:ilvl w:val="0"/>
-          <w:numId w:val="1024"/>
-        </w:numPr>
-        <w:pStyle w:val="Compact"/>
-      </w:pPr>
-      <w:r>
-        <w:rPr>
-          <w:bCs/>
-          <w:b/>
-        </w:rPr>
-        <w:t xml:space="preserve">Mechanism:</w:t>
-      </w:r>
-      <w:r>
-        <w:t xml:space="preserve"> </w:t>
-      </w:r>
-      <w:r>
-        <w:t xml:space="preserve">Domain-specific language based on Message Sequence Charts (MSCs). Syntax-directed projection generates deadlock-free local agent programs from global coordination specifications. Owned control flow with explicit deciders. Control broadcasts ensure non-owner lifelines observe branch choices.</w:t>
-      </w:r>
-    </w:p>
-    <w:p>
-      <w:pPr>
-        <w:numPr>
-          <w:ilvl w:val="0"/>
-          <w:numId w:val="1024"/>
-        </w:numPr>
-        <w:pStyle w:val="Compact"/>
-      </w:pPr>
-      <w:r>
-        <w:rPr>
-          <w:bCs/>
-          <w:b/>
-        </w:rPr>
-        <w:t xml:space="preserve">Results:</w:t>
-      </w:r>
-      <w:r>
-        <w:t xml:space="preserve"> </w:t>
-      </w:r>
-      <w:r>
-        <w:t xml:space="preserve">Deadlock-free by construction. Coordination properties established independently of LLM nondeterminism. Runtime planning extension: LLM generates workflows with same structural guarantees.</w:t>
-      </w:r>
-    </w:p>
-    <w:p>
-      <w:pPr>
-        <w:numPr>
-          <w:ilvl w:val="0"/>
-          <w:numId w:val="1024"/>
-        </w:numPr>
-        <w:pStyle w:val="Compact"/>
-      </w:pPr>
-      <w:r>
-        <w:rPr>
-          <w:bCs/>
-          <w:b/>
-        </w:rPr>
-        <w:t xml:space="preserve">Open source:</w:t>
-      </w:r>
-      <w:r>
-        <w:t xml:space="preserve"> </w:t>
-      </w:r>
-      <w:r>
-        <w:t xml:space="preserve">ZipperGen — https://zippergen.io</w:t>
-      </w:r>
-    </w:p>
-    <w:p>
-      <w:pPr>
-        <w:numPr>
-          <w:ilvl w:val="0"/>
-          <w:numId w:val="1024"/>
-        </w:numPr>
-        <w:pStyle w:val="Compact"/>
-      </w:pPr>
-      <w:r>
-        <w:rPr>
-          <w:bCs/>
-          <w:b/>
-        </w:rPr>
-        <w:t xml:space="preserve">Gap:</w:t>
-      </w:r>
-      <w:r>
-        <w:t xml:space="preserve"> </w:t>
-      </w:r>
-      <w:r>
-        <w:t xml:space="preserve">Does not verify LLM action content (opaque by design). No runtime behavioral enforcement beyond coordination structure.</w:t>
-      </w:r>
-    </w:p>
-    <w:p>
-      <w:r>
-        <w:pict>
-          <v:rect style="width:0;height:1.5pt" o:hralign="center" o:hrstd="t" o:hr="t"/>
-        </w:pict>
-      </w:r>
-    </w:p>
     <w:bookmarkEnd w:id="54"/>
-    <w:bookmarkEnd w:id="55"/>
-    <w:bookmarkStart w:id="56" w:name="Xbe24b76ee5dd84a10ed4cfa602ccbb90704f1ec"/>
+    <w:bookmarkStart w:id="55" w:name="Xbe24b76ee5dd84a10ed4cfa602ccbb90704f1ec"/>
     <w:p>
       <w:pPr>
         <w:pStyle w:val="Heading3"/>
@@ -5111,8 +4968,8 @@
         </w:pict>
       </w:r>
     </w:p>
-    <w:bookmarkEnd w:id="56"/>
-    <w:bookmarkStart w:id="57" w:name="Xa43c698aa5441234cc980e8d4b4054fad19fe04"/>
+    <w:bookmarkEnd w:id="55"/>
+    <w:bookmarkStart w:id="56" w:name="Xa43c698aa5441234cc980e8d4b4054fad19fe04"/>
     <w:p>
       <w:pPr>
         <w:pStyle w:val="Heading3"/>
@@ -5596,8 +5453,8 @@
         </w:pict>
       </w:r>
     </w:p>
-    <w:bookmarkEnd w:id="57"/>
-    <w:bookmarkStart w:id="58" w:name="verdict-on-question-3"/>
+    <w:bookmarkEnd w:id="56"/>
+    <w:bookmarkStart w:id="57" w:name="verdict-on-question-3"/>
     <w:p>
       <w:pPr>
         <w:pStyle w:val="Heading3"/>
@@ -5695,8 +5552,8 @@
         </w:pict>
       </w:r>
     </w:p>
+    <w:bookmarkEnd w:id="57"/>
     <w:bookmarkEnd w:id="58"/>
-    <w:bookmarkEnd w:id="59"/>
     <w:bookmarkStart w:id="62" w:name="overall-assessment"/>
     <w:p>
       <w:pPr>
@@ -5706,13 +5563,13 @@
         <w:t xml:space="preserve">Overall Assessment</w:t>
       </w:r>
     </w:p>
-    <w:bookmarkStart w:id="60" w:name="the-three-questions-synthesis"/>
+    <w:bookmarkStart w:id="59" w:name="Xd72e727a73a82e631259e677bd1c9c1c88a8203"/>
     <w:p>
       <w:pPr>
         <w:pStyle w:val="Heading3"/>
       </w:pPr>
       <w:r>
-        <w:t xml:space="preserve">The Three Questions — Synthesis</w:t>
+        <w:t xml:space="preserve">The Three Questions — Comprehensive Synthesis</w:t>
       </w:r>
     </w:p>
     <w:tbl>
@@ -5723,10 +5580,11 @@
         <w:jc w:val="start"/>
       </w:tblPr>
       <w:tblGrid>
-        <w:gridCol w:w="1342"/>
-        <w:gridCol w:w="1073"/>
-        <w:gridCol w:w="2550"/>
-        <w:gridCol w:w="2953"/>
+        <w:gridCol w:w="1015"/>
+        <w:gridCol w:w="812"/>
+        <w:gridCol w:w="1929"/>
+        <w:gridCol w:w="2233"/>
+        <w:gridCol w:w="1929"/>
       </w:tblGrid>
       <w:tr>
         <w:trPr>
@@ -5780,6 +5638,18 @@
             </w:r>
           </w:p>
         </w:tc>
+        <w:tc>
+          <w:tcPr/>
+          <w:p>
+            <w:pPr>
+              <w:pStyle w:val="Compact"/>
+              <w:jc w:val="left"/>
+            </w:pPr>
+            <w:r>
+              <w:t xml:space="preserve">What Remains Open</w:t>
+            </w:r>
+          </w:p>
+        </w:tc>
       </w:tr>
       <w:tr>
         <w:tc>
@@ -5834,6 +5704,18 @@
             </w:r>
           </w:p>
         </w:tc>
+        <w:tc>
+          <w:tcPr/>
+          <w:p>
+            <w:pPr>
+              <w:pStyle w:val="Compact"/>
+              <w:jc w:val="left"/>
+            </w:pPr>
+            <w:r>
+              <w:t xml:space="preserve">Proving deterministic mandate from skill markdown alone — impossible without L3 enforcement</w:t>
+            </w:r>
+          </w:p>
+        </w:tc>
       </w:tr>
       <w:tr>
         <w:tc>
@@ -5908,6 +5790,18 @@
             </w:r>
           </w:p>
         </w:tc>
+        <w:tc>
+          <w:tcPr/>
+          <w:p>
+            <w:pPr>
+              <w:pStyle w:val="Compact"/>
+              <w:jc w:val="left"/>
+            </w:pPr>
+            <w:r>
+              <w:t xml:space="preserve">Behavioral typing of LLM action content; skill-skill composition within single agent</w:t>
+            </w:r>
+          </w:p>
+        </w:tc>
       </w:tr>
       <w:tr>
         <w:tc>
@@ -5982,6 +5876,287 @@
             </w:r>
           </w:p>
         </w:tc>
+        <w:tc>
+          <w:tcPr/>
+          <w:p>
+            <w:pPr>
+              <w:pStyle w:val="Compact"/>
+              <w:jc w:val="left"/>
+            </w:pPr>
+            <w:r>
+              <w:t xml:space="preserve">Runtime enforcement of what LLMs do inside action blocks; blame assignment; automatic rollback</w:t>
+            </w:r>
+          </w:p>
+        </w:tc>
+      </w:tr>
+    </w:tbl>
+    <w:bookmarkEnd w:id="59"/>
+    <w:bookmarkStart w:id="60" w:name="the-three-questions-layer-mapping"/>
+    <w:p>
+      <w:pPr>
+        <w:pStyle w:val="Heading3"/>
+      </w:pPr>
+      <w:r>
+        <w:t xml:space="preserve">The Three Questions — Layer Mapping</w:t>
+      </w:r>
+    </w:p>
+    <w:tbl>
+      <w:tblPr>
+        <w:tblStyle w:val="Table"/>
+        <w:tblW w:type="pct" w:w="5000"/>
+        <w:tblLook w:firstRow="1" w:lastRow="0" w:firstColumn="0" w:lastColumn="0" w:noHBand="0" w:noVBand="0" w:val="0020"/>
+        <w:jc w:val="start"/>
+      </w:tblPr>
+      <w:tblGrid>
+        <w:gridCol w:w="1200"/>
+        <w:gridCol w:w="1800"/>
+        <w:gridCol w:w="2280"/>
+        <w:gridCol w:w="2640"/>
+      </w:tblGrid>
+      <w:tr>
+        <w:trPr>
+          <w:tblHeader w:val="true"/>
+        </w:trPr>
+        <w:tc>
+          <w:tcPr/>
+          <w:p>
+            <w:pPr>
+              <w:pStyle w:val="Compact"/>
+              <w:jc w:val="left"/>
+            </w:pPr>
+            <w:r>
+              <w:t xml:space="preserve">Question</w:t>
+            </w:r>
+          </w:p>
+        </w:tc>
+        <w:tc>
+          <w:tcPr/>
+          <w:p>
+            <w:pPr>
+              <w:pStyle w:val="Compact"/>
+              <w:jc w:val="left"/>
+            </w:pPr>
+            <w:r>
+              <w:t xml:space="preserve">Layer 0 (Spec)</w:t>
+            </w:r>
+          </w:p>
+        </w:tc>
+        <w:tc>
+          <w:tcPr/>
+          <w:p>
+            <w:pPr>
+              <w:pStyle w:val="Compact"/>
+              <w:jc w:val="left"/>
+            </w:pPr>
+            <w:r>
+              <w:t xml:space="preserve">Layer 1 (Runtime)</w:t>
+            </w:r>
+          </w:p>
+        </w:tc>
+        <w:tc>
+          <w:tcPr/>
+          <w:p>
+            <w:pPr>
+              <w:pStyle w:val="Compact"/>
+              <w:jc w:val="left"/>
+            </w:pPr>
+            <w:r>
+              <w:t xml:space="preserve">Layer 2 (Behavioral)</w:t>
+            </w:r>
+          </w:p>
+        </w:tc>
+      </w:tr>
+      <w:tr>
+        <w:tc>
+          <w:tcPr/>
+          <w:p>
+            <w:pPr>
+              <w:pStyle w:val="Compact"/>
+              <w:jc w:val="left"/>
+            </w:pPr>
+            <w:r>
+              <w:rPr>
+                <w:bCs/>
+                <w:b/>
+              </w:rPr>
+              <w:t xml:space="preserve">Q1: Do skills affect behavior?</w:t>
+            </w:r>
+          </w:p>
+        </w:tc>
+        <w:tc>
+          <w:tcPr/>
+          <w:p>
+            <w:pPr>
+              <w:pStyle w:val="Compact"/>
+              <w:jc w:val="left"/>
+            </w:pPr>
+            <w:r>
+              <w:t xml:space="preserve">BIV, SSL, GovernSpec (empirical evidence)</w:t>
+            </w:r>
+          </w:p>
+        </w:tc>
+        <w:tc>
+          <w:tcPr/>
+          <w:p>
+            <w:pPr>
+              <w:pStyle w:val="Compact"/>
+              <w:jc w:val="left"/>
+            </w:pPr>
+            <w:r>
+              <w:t xml:space="preserve">ClawHavoc (incident data)</w:t>
+            </w:r>
+          </w:p>
+        </w:tc>
+        <w:tc>
+          <w:tcPr/>
+          <w:p>
+            <w:pPr>
+              <w:pStyle w:val="Compact"/>
+              <w:jc w:val="left"/>
+            </w:pPr>
+            <w:r>
+              <w:t xml:space="preserve">—</w:t>
+            </w:r>
+          </w:p>
+        </w:tc>
+      </w:tr>
+      <w:tr>
+        <w:tc>
+          <w:tcPr/>
+          <w:p>
+            <w:pPr>
+              <w:pStyle w:val="Compact"/>
+              <w:jc w:val="left"/>
+            </w:pPr>
+            <w:r>
+              <w:rPr>
+                <w:bCs/>
+                <w:b/>
+              </w:rPr>
+              <w:t xml:space="preserve">Q2: Static type checking?</w:t>
+            </w:r>
+          </w:p>
+        </w:tc>
+        <w:tc>
+          <w:tcPr/>
+          <w:p>
+            <w:pPr>
+              <w:pStyle w:val="Compact"/>
+              <w:jc w:val="left"/>
+            </w:pPr>
+            <w:r>
+              <w:rPr>
+                <w:bCs/>
+                <w:b/>
+              </w:rPr>
+              <w:t xml:space="preserve">ZipperGen</w:t>
+            </w:r>
+            <w:r>
+              <w:t xml:space="preserve"> </w:t>
+            </w:r>
+            <w:r>
+              <w:t xml:space="preserve">(global specs), SkillFortify (code analysis), GovernSpec (contracts)</w:t>
+            </w:r>
+          </w:p>
+        </w:tc>
+        <w:tc>
+          <w:tcPr/>
+          <w:p>
+            <w:pPr>
+              <w:pStyle w:val="Compact"/>
+              <w:jc w:val="left"/>
+            </w:pPr>
+            <w:r>
+              <w:t xml:space="preserve">—</w:t>
+            </w:r>
+          </w:p>
+        </w:tc>
+        <w:tc>
+          <w:tcPr/>
+          <w:p>
+            <w:pPr>
+              <w:pStyle w:val="Compact"/>
+              <w:jc w:val="left"/>
+            </w:pPr>
+            <w:r>
+              <w:t xml:space="preserve">—</w:t>
+            </w:r>
+          </w:p>
+        </w:tc>
+      </w:tr>
+      <w:tr>
+        <w:tc>
+          <w:tcPr/>
+          <w:p>
+            <w:pPr>
+              <w:pStyle w:val="Compact"/>
+              <w:jc w:val="left"/>
+            </w:pPr>
+            <w:r>
+              <w:rPr>
+                <w:bCs/>
+                <w:b/>
+              </w:rPr>
+              <w:t xml:space="preserve">Q3: Deterministic runtime?</w:t>
+            </w:r>
+          </w:p>
+        </w:tc>
+        <w:tc>
+          <w:tcPr/>
+          <w:p>
+            <w:pPr>
+              <w:pStyle w:val="Compact"/>
+              <w:jc w:val="left"/>
+            </w:pPr>
+            <w:r>
+              <w:rPr>
+                <w:bCs/>
+                <w:b/>
+              </w:rPr>
+              <w:t xml:space="preserve">ZipperGen</w:t>
+            </w:r>
+            <w:r>
+              <w:t xml:space="preserve"> </w:t>
+            </w:r>
+            <w:r>
+              <w:t xml:space="preserve">(projection)</w:t>
+            </w:r>
+          </w:p>
+        </w:tc>
+        <w:tc>
+          <w:tcPr/>
+          <w:p>
+            <w:pPr>
+              <w:pStyle w:val="Compact"/>
+              <w:jc w:val="left"/>
+            </w:pPr>
+            <w:r>
+              <w:rPr>
+                <w:bCs/>
+                <w:b/>
+              </w:rPr>
+              <w:t xml:space="preserve">ZipperGen</w:t>
+            </w:r>
+            <w:r>
+              <w:t xml:space="preserve"> </w:t>
+            </w:r>
+            <w:r>
+              <w:t xml:space="preserve">(local programs), ACP (admission control), ABC (contracts)</w:t>
+            </w:r>
+          </w:p>
+        </w:tc>
+        <w:tc>
+          <w:tcPr/>
+          <w:p>
+            <w:pPr>
+              <w:pStyle w:val="Compact"/>
+              <w:jc w:val="left"/>
+            </w:pPr>
+            <w:r>
+              <w:t xml:space="preserve">AgentVerify (hybrid), Trace-Based (replay)</w:t>
+            </w:r>
+          </w:p>
+        </w:tc>
       </w:tr>
     </w:tbl>
     <w:bookmarkEnd w:id="60"/>
@@ -6525,7 +6700,7 @@
         <w:rPr>
           <w:rStyle w:val="VerbatimChar"/>
         </w:rPr>
-        <w:t xml:space="preserve">    ├─ Message passing (deterministic, guaranteed)</w:t>
+        <w:t xml:space="preserve">    ├─ Message passing (deterministic, guaranteed by ZipperGen)</w:t>
       </w:r>
       <w:r>
         <w:br/>
@@ -6605,21 +6780,355 @@
         </w:pict>
       </w:r>
     </w:p>
-    <w:p>
-      <w:pPr>
-        <w:pStyle w:val="FirstParagraph"/>
-      </w:pPr>
+    <w:bookmarkEnd w:id="61"/>
+    <w:bookmarkEnd w:id="62"/>
+    <w:bookmarkStart w:id="66" w:name="conclusion"/>
+    <w:p>
+      <w:pPr>
+        <w:pStyle w:val="Heading2"/>
+      </w:pPr>
+      <w:r>
+        <w:t xml:space="preserve">Conclusion</w:t>
+      </w:r>
+    </w:p>
+    <w:bookmarkStart w:id="63" w:name="what-we-know-2026"/>
+    <w:p>
+      <w:pPr>
+        <w:pStyle w:val="Heading3"/>
+      </w:pPr>
+      <w:r>
+        <w:t xml:space="preserve">What We Know (2026)</w:t>
+      </w:r>
+    </w:p>
+    <w:p>
+      <w:pPr>
+        <w:numPr>
+          <w:ilvl w:val="0"/>
+          <w:numId w:val="1024"/>
+        </w:numPr>
+      </w:pPr>
+      <w:r>
+        <w:rPr>
+          <w:bCs/>
+          <w:b/>
+        </w:rPr>
+        <w:t xml:space="preserve">Skills do affect behavior</w:t>
+      </w:r>
+      <w:r>
+        <w:t xml:space="preserve"> </w:t>
+      </w:r>
+      <w:r>
+        <w:t xml:space="preserve">— empirically proven by BIV (80% deviation means agents are trying to follow instructions), SSL (94% structure extraction), and ClawHavoc (1,200+ malicious skills show skills are a real threat vector). But this is probabilistic, not deterministic.</w:t>
+      </w:r>
+    </w:p>
+    <w:p>
+      <w:pPr>
+        <w:numPr>
+          <w:ilvl w:val="0"/>
+          <w:numId w:val="1024"/>
+        </w:numPr>
+      </w:pPr>
+      <w:r>
+        <w:rPr>
+          <w:bCs/>
+          <w:b/>
+        </w:rPr>
+        <w:t xml:space="preserve">Formal static checking exists for multi-agent coordination</w:t>
+      </w:r>
+      <w:r>
+        <w:t xml:space="preserve"> </w:t>
+      </w:r>
+      <w:r>
+        <w:t xml:space="preserve">— ZipperGen provides deadlock-free-by-construction guarantees via syntax-directed projection from MSC-based global specs. This closes the MPST gap for coordination structure.</w:t>
+      </w:r>
+    </w:p>
+    <w:p>
+      <w:pPr>
+        <w:numPr>
+          <w:ilvl w:val="0"/>
+          <w:numId w:val="1024"/>
+        </w:numPr>
+      </w:pPr>
+      <w:r>
+        <w:rPr>
+          <w:bCs/>
+          <w:b/>
+        </w:rPr>
+        <w:t xml:space="preserve">Deterministic runtime enforcement exists for both single-agent and multi-agent</w:t>
+      </w:r>
+      <w:r>
+        <w:t xml:space="preserve"> </w:t>
+      </w:r>
+      <w:r>
+        <w:t xml:space="preserve">— ACP (sub-microsecond, TLA+ verified), ABC/AgentAssert (&lt;10ms, Drift Bounds Theorem), and ZipperGen (structural induction proof) all provide deterministic enforcement without LLM-as-judge.</w:t>
+      </w:r>
+    </w:p>
+    <w:bookmarkEnd w:id="63"/>
+    <w:bookmarkStart w:id="64" w:name="what-we-dont-know-the-open-frontier"/>
+    <w:p>
+      <w:pPr>
+        <w:pStyle w:val="Heading3"/>
+      </w:pPr>
+      <w:r>
+        <w:t xml:space="preserve">What We Don’t Know (The Open Frontier)</w:t>
+      </w:r>
+    </w:p>
+    <w:p>
+      <w:pPr>
+        <w:numPr>
+          <w:ilvl w:val="0"/>
+          <w:numId w:val="1025"/>
+        </w:numPr>
+      </w:pPr>
+      <w:r>
+        <w:rPr>
+          <w:bCs/>
+          <w:b/>
+        </w:rPr>
+        <w:t xml:space="preserve">Behavioral typing of LLM action content</w:t>
+      </w:r>
+      <w:r>
+        <w:t xml:space="preserve"> </w:t>
+      </w:r>
+      <w:r>
+        <w:t xml:space="preserve">— ZipperGen treats actions as opaque. No paper verifies</w:t>
+      </w:r>
+      <w:r>
+        <w:t xml:space="preserve"> </w:t>
+      </w:r>
       <w:r>
         <w:rPr>
           <w:iCs/>
           <w:i/>
         </w:rPr>
+        <w:t xml:space="preserve">what</w:t>
+      </w:r>
+      <w:r>
+        <w:t xml:space="preserve"> </w:t>
+      </w:r>
+      <w:r>
+        <w:t xml:space="preserve">LLMs compute inside action blocks.</w:t>
+      </w:r>
+    </w:p>
+    <w:p>
+      <w:pPr>
+        <w:numPr>
+          <w:ilvl w:val="0"/>
+          <w:numId w:val="1025"/>
+        </w:numPr>
+      </w:pPr>
+      <w:r>
+        <w:rPr>
+          <w:bCs/>
+          <w:b/>
+        </w:rPr>
+        <w:t xml:space="preserve">Skill-skill composition within a single agent</w:t>
+      </w:r>
+      <w:r>
+        <w:t xml:space="preserve"> </w:t>
+      </w:r>
+      <w:r>
+        <w:t xml:space="preserve">— No static analysis of how multiple skills loaded by one agent interact.</w:t>
+      </w:r>
+    </w:p>
+    <w:p>
+      <w:pPr>
+        <w:numPr>
+          <w:ilvl w:val="0"/>
+          <w:numId w:val="1025"/>
+        </w:numPr>
+      </w:pPr>
+      <w:r>
+        <w:rPr>
+          <w:bCs/>
+          <w:b/>
+        </w:rPr>
+        <w:t xml:space="preserve">Blame assignment in multi-agent violations</w:t>
+      </w:r>
+      <w:r>
+        <w:t xml:space="preserve"> </w:t>
+      </w:r>
+      <w:r>
+        <w:t xml:space="preserve">— When something goes wrong, who is responsible? ZipperGen provides no mechanism.</w:t>
+      </w:r>
+    </w:p>
+    <w:p>
+      <w:pPr>
+        <w:numPr>
+          <w:ilvl w:val="0"/>
+          <w:numId w:val="1025"/>
+        </w:numPr>
+      </w:pPr>
+      <w:r>
+        <w:rPr>
+          <w:bCs/>
+          <w:b/>
+        </w:rPr>
+        <w:t xml:space="preserve">Automatic rollback</w:t>
+      </w:r>
+      <w:r>
+        <w:t xml:space="preserve"> </w:t>
+      </w:r>
+      <w:r>
+        <w:t xml:space="preserve">— ABC has Recovery (R) contracts for single-agent, but multi-agent rollback is unaddressed.</w:t>
+      </w:r>
+    </w:p>
+    <w:p>
+      <w:pPr>
+        <w:numPr>
+          <w:ilvl w:val="0"/>
+          <w:numId w:val="1025"/>
+        </w:numPr>
+      </w:pPr>
+      <w:r>
+        <w:rPr>
+          <w:bCs/>
+          <w:b/>
+        </w:rPr>
+        <w:t xml:space="preserve">Formal guarantee that skill markdown alone determines behavior</w:t>
+      </w:r>
+      <w:r>
+        <w:t xml:space="preserve"> </w:t>
+      </w:r>
+      <w:r>
+        <w:t xml:space="preserve">— Impossible without L3 runtime enforcement. LLM internals, context truncation, system prompts, and user messages all contribute.</w:t>
+      </w:r>
+    </w:p>
+    <w:bookmarkEnd w:id="64"/>
+    <w:bookmarkStart w:id="65" w:name="the-path-forward"/>
+    <w:p>
+      <w:pPr>
+        <w:pStyle w:val="Heading3"/>
+      </w:pPr>
+      <w:r>
+        <w:t xml:space="preserve">The Path Forward</w:t>
+      </w:r>
+    </w:p>
+    <w:p>
+      <w:pPr>
+        <w:pStyle w:val="FirstParagraph"/>
+      </w:pPr>
+      <w:r>
+        <w:t xml:space="preserve">The user’s intuition about MPST-style governance was prescient. ZipperGen (arXiv:2604.17612) proves that formal multi-agent coordination with guaranteed deadlock-freedom is not just theoretical — it is implementable, open-source, and compatible with LLM runtime planning. The next step is not to invent MPST for agents, but to</w:t>
+      </w:r>
+      <w:r>
+        <w:t xml:space="preserve"> </w:t>
+      </w:r>
+      <w:r>
+        <w:rPr>
+          <w:bCs/>
+          <w:b/>
+        </w:rPr>
+        <w:t xml:space="preserve">extend ZipperGen with behavioral typing, blame assignment, and rollback mechanisms</w:t>
+      </w:r>
+      <w:r>
+        <w:t xml:space="preserve">.</w:t>
+      </w:r>
+    </w:p>
+    <w:p>
+      <w:pPr>
+        <w:pStyle w:val="BodyText"/>
+      </w:pPr>
+      <w:r>
+        <w:t xml:space="preserve">The research agenda should focus on:</w:t>
+      </w:r>
+      <w:r>
+        <w:t xml:space="preserve"> </w:t>
+      </w:r>
+      <w:r>
+        <w:t xml:space="preserve">-</w:t>
+      </w:r>
+      <w:r>
+        <w:t xml:space="preserve"> </w:t>
+      </w:r>
+      <w:r>
+        <w:rPr>
+          <w:bCs/>
+          <w:b/>
+        </w:rPr>
+        <w:t xml:space="preserve">Action-level contracts</w:t>
+      </w:r>
+      <w:r>
+        <w:t xml:space="preserve"> </w:t>
+      </w:r>
+      <w:r>
+        <w:t xml:space="preserve">inside ZipperGen’s action blocks (integrating ABC/AgentAssert)</w:t>
+      </w:r>
+      <w:r>
+        <w:t xml:space="preserve"> </w:t>
+      </w:r>
+      <w:r>
+        <w:t xml:space="preserve">-</w:t>
+      </w:r>
+      <w:r>
+        <w:t xml:space="preserve"> </w:t>
+      </w:r>
+      <w:r>
+        <w:rPr>
+          <w:bCs/>
+          <w:b/>
+        </w:rPr>
+        <w:t xml:space="preserve">Skill composition analysis</w:t>
+      </w:r>
+      <w:r>
+        <w:t xml:space="preserve"> </w:t>
+      </w:r>
+      <w:r>
+        <w:t xml:space="preserve">for single-agent multi-skill scenarios (applying ZipperGen’s projection logic to intra-agent interactions)</w:t>
+      </w:r>
+      <w:r>
+        <w:t xml:space="preserve"> </w:t>
+      </w:r>
+      <w:r>
+        <w:t xml:space="preserve">-</w:t>
+      </w:r>
+      <w:r>
+        <w:t xml:space="preserve"> </w:t>
+      </w:r>
+      <w:r>
+        <w:rPr>
+          <w:bCs/>
+          <w:b/>
+        </w:rPr>
+        <w:t xml:space="preserve">Blame and rollback</w:t>
+      </w:r>
+      <w:r>
+        <w:t xml:space="preserve"> </w:t>
+      </w:r>
+      <w:r>
+        <w:t xml:space="preserve">as first-class primitives in the coordination DSL (extending ZipperGen’s owned control flow with violation handling)</w:t>
+      </w:r>
+    </w:p>
+    <w:p>
+      <w:pPr>
+        <w:pStyle w:val="BodyText"/>
+      </w:pPr>
+      <w:r>
+        <w:t xml:space="preserve">The Three-Layer Governance Stack is not a wishlist — it is a near-term engineering roadmap. The papers are already being written. The tools are already being built. The gap is closing.</w:t>
+      </w:r>
+    </w:p>
+    <w:p>
+      <w:r>
+        <w:pict>
+          <v:rect style="width:0;height:1.5pt" o:hralign="center" o:hrstd="t" o:hr="t"/>
+        </w:pict>
+      </w:r>
+    </w:p>
+    <w:p>
+      <w:pPr>
+        <w:pStyle w:val="FirstParagraph"/>
+      </w:pPr>
+      <w:r>
+        <w:rPr>
+          <w:iCs/>
+          <w:i/>
+        </w:rPr>
         <w:t xml:space="preserve">Compiled by EvaPaper | Based on 29 papers across the Three-Layer Governance Stack</w:t>
       </w:r>
     </w:p>
-    <w:bookmarkEnd w:id="61"/>
-    <w:bookmarkEnd w:id="62"/>
-    <w:bookmarkEnd w:id="63"/>
+    <w:bookmarkEnd w:id="65"/>
+    <w:bookmarkEnd w:id="66"/>
+    <w:bookmarkEnd w:id="67"/>
     <w:sectPr/>
   </w:body>
 </w:document>
@@ -6796,6 +7305,91 @@
     <w:lvl w:ilvl="8">
       <w:numFmt w:val="bullet"/>
       <w:lvlText w:val="•"/>
+      <w:lvlJc w:val="left"/>
+      <w:pPr>
+        <w:ind w:left="6480" w:hanging="480"/>
+      </w:pPr>
+    </w:lvl>
+  </w:abstractNum>
+  <w:abstractNum w:abstractNumId="99411">
+    <w:nsid w:val="A99411"/>
+    <w:multiLevelType w:val="multilevel"/>
+    <w:lvl w:ilvl="0">
+      <w:start w:val="1"/>
+      <w:numFmt w:val="decimal"/>
+      <w:lvlText w:val="%1."/>
+      <w:lvlJc w:val="left"/>
+      <w:pPr>
+        <w:ind w:left="720" w:hanging="480"/>
+      </w:pPr>
+    </w:lvl>
+    <w:lvl w:ilvl="1">
+      <w:start w:val="1"/>
+      <w:numFmt w:val="decimal"/>
+      <w:lvlText w:val="%2."/>
+      <w:lvlJc w:val="left"/>
+      <w:pPr>
+        <w:ind w:left="1440" w:hanging="480"/>
+      </w:pPr>
+    </w:lvl>
+    <w:lvl w:ilvl="2">
+      <w:start w:val="1"/>
+      <w:numFmt w:val="decimal"/>
+      <w:lvlText w:val="%3."/>
+      <w:lvlJc w:val="left"/>
+      <w:pPr>
+        <w:ind w:left="2160" w:hanging="480"/>
+      </w:pPr>
+    </w:lvl>
+    <w:lvl w:ilvl="3">
+      <w:start w:val="1"/>
+      <w:numFmt w:val="decimal"/>
+      <w:lvlText w:val="%4."/>
+      <w:lvlJc w:val="left"/>
+      <w:pPr>
+        <w:ind w:left="2880" w:hanging="480"/>
+      </w:pPr>
+    </w:lvl>
+    <w:lvl w:ilvl="4">
+      <w:start w:val="1"/>
+      <w:numFmt w:val="decimal"/>
+      <w:lvlText w:val="%5."/>
+      <w:lvlJc w:val="left"/>
+      <w:pPr>
+        <w:ind w:left="3600" w:hanging="480"/>
+      </w:pPr>
+    </w:lvl>
+    <w:lvl w:ilvl="5">
+      <w:start w:val="1"/>
+      <w:numFmt w:val="decimal"/>
+      <w:lvlText w:val="%6."/>
+      <w:lvlJc w:val="left"/>
+      <w:pPr>
+        <w:ind w:left="4320" w:hanging="480"/>
+      </w:pPr>
+    </w:lvl>
+    <w:lvl w:ilvl="6">
+      <w:start w:val="1"/>
+      <w:numFmt w:val="decimal"/>
+      <w:lvlText w:val="%7."/>
+      <w:lvlJc w:val="left"/>
+      <w:pPr>
+        <w:ind w:left="5040" w:hanging="480"/>
+      </w:pPr>
+    </w:lvl>
+    <w:lvl w:ilvl="7">
+      <w:start w:val="1"/>
+      <w:numFmt w:val="decimal"/>
+      <w:lvlText w:val="%8."/>
+      <w:lvlJc w:val="left"/>
+      <w:pPr>
+        <w:ind w:left="5760" w:hanging="480"/>
+      </w:pPr>
+    </w:lvl>
+    <w:lvl w:ilvl="8">
+      <w:start w:val="1"/>
+      <w:numFmt w:val="decimal"/>
+      <w:lvlText w:val="%9."/>
       <w:lvlJc w:val="left"/>
       <w:pPr>
         <w:ind w:left="6480" w:hanging="480"/>
@@ -6875,7 +7469,64 @@
     <w:abstractNumId w:val="991"/>
   </w:num>
   <w:num w:numId="1024">
-    <w:abstractNumId w:val="991"/>
+    <w:abstractNumId w:val="99411"/>
+    <w:lvlOverride w:ilvl="0">
+      <w:startOverride w:val="1"/>
+    </w:lvlOverride>
+    <w:lvlOverride w:ilvl="1">
+      <w:startOverride w:val="1"/>
+    </w:lvlOverride>
+    <w:lvlOverride w:ilvl="2">
+      <w:startOverride w:val="1"/>
+    </w:lvlOverride>
+    <w:lvlOverride w:ilvl="3">
+      <w:startOverride w:val="1"/>
+    </w:lvlOverride>
+    <w:lvlOverride w:ilvl="4">
+      <w:startOverride w:val="1"/>
+    </w:lvlOverride>
+    <w:lvlOverride w:ilvl="5">
+      <w:startOverride w:val="1"/>
+    </w:lvlOverride>
+    <w:lvlOverride w:ilvl="6">
+      <w:startOverride w:val="1"/>
+    </w:lvlOverride>
+    <w:lvlOverride w:ilvl="7">
+      <w:startOverride w:val="1"/>
+    </w:lvlOverride>
+    <w:lvlOverride w:ilvl="8">
+      <w:startOverride w:val="1"/>
+    </w:lvlOverride>
+  </w:num>
+  <w:num w:numId="1025">
+    <w:abstractNumId w:val="99411"/>
+    <w:lvlOverride w:ilvl="0">
+      <w:startOverride w:val="1"/>
+    </w:lvlOverride>
+    <w:lvlOverride w:ilvl="1">
+      <w:startOverride w:val="1"/>
+    </w:lvlOverride>
+    <w:lvlOverride w:ilvl="2">
+      <w:startOverride w:val="1"/>
+    </w:lvlOverride>
+    <w:lvlOverride w:ilvl="3">
+      <w:startOverride w:val="1"/>
+    </w:lvlOverride>
+    <w:lvlOverride w:ilvl="4">
+      <w:startOverride w:val="1"/>
+    </w:lvlOverride>
+    <w:lvlOverride w:ilvl="5">
+      <w:startOverride w:val="1"/>
+    </w:lvlOverride>
+    <w:lvlOverride w:ilvl="6">
+      <w:startOverride w:val="1"/>
+    </w:lvlOverride>
+    <w:lvlOverride w:ilvl="7">
+      <w:startOverride w:val="1"/>
+    </w:lvlOverride>
+    <w:lvlOverride w:ilvl="8">
+      <w:startOverride w:val="1"/>
+    </w:lvlOverride>
   </w:num>
 </w:numbering>
 </file>

</xml_diff>